<commit_message>
Incorporate resume content and humanize bio copy
- Updated experience section descriptions to match current resume:
  - Celnet: added bid opportunity intake metric
  - xAI: expanded incident-response platform work, added prompt engineering to chips
  - WSU: added NLP preprocessing pipelines detail
  - Deloitte: revised framing and responsiveness metrics
- Cleaned prose by removing em dashes per bio humanization audit
- Updated case study descriptions to match resume detail level
- Added current resume to public/resume.docx
- Updated About section with personal interests (singing, writing, dancing, badminton)
- Refined meta description and hero copy for clarity

Co-Authored-By: Claude Sonnet 4.6 <noreply@anthropic.com>
</commit_message>
<xml_diff>
--- a/public/resume.docx
+++ b/public/resume.docx
@@ -14,8 +14,8 @@
           <w:bCs/>
           <w:color w:val="1F3864"/>
           <w:spacing w:val="80"/>
-          <w:sz w:val="42"/>
-          <w:szCs w:val="42"/>
+          <w:sz w:val="44"/>
+          <w:szCs w:val="44"/>
         </w:rPr>
         <w:t>ARNAV JAIN</w:t>
       </w:r>
@@ -33,47 +33,7 @@
           <w:sz w:val="19"/>
           <w:szCs w:val="19"/>
         </w:rPr>
-        <w:t>Agentic AI</w:t>
-      </w:r>
-      <w:r>
-        <w:rPr>
-          <w:rFonts w:ascii="Calibri" w:eastAsia="Calibri" w:hAnsi="Calibri" w:cs="Calibri"/>
-          <w:color w:val="2E5C8A"/>
-          <w:spacing w:val="16"/>
-          <w:sz w:val="19"/>
-          <w:szCs w:val="19"/>
-        </w:rPr>
-        <w:t xml:space="preserve"> ·  Conversational AI  ·  </w:t>
-      </w:r>
-      <w:r>
-        <w:rPr>
-          <w:rFonts w:ascii="Calibri" w:eastAsia="Calibri" w:hAnsi="Calibri" w:cs="Calibri"/>
-          <w:color w:val="2E5C8A"/>
-          <w:spacing w:val="16"/>
-          <w:sz w:val="19"/>
-          <w:szCs w:val="19"/>
-        </w:rPr>
-        <w:t>Gen AI</w:t>
-      </w:r>
-      <w:r>
-        <w:rPr>
-          <w:rFonts w:ascii="Calibri" w:eastAsia="Calibri" w:hAnsi="Calibri" w:cs="Calibri"/>
-          <w:color w:val="2E5C8A"/>
-          <w:spacing w:val="16"/>
-          <w:sz w:val="19"/>
-          <w:szCs w:val="19"/>
-        </w:rPr>
-        <w:t xml:space="preserve">  ·  </w:t>
-      </w:r>
-      <w:r>
-        <w:rPr>
-          <w:rFonts w:ascii="Calibri" w:eastAsia="Calibri" w:hAnsi="Calibri" w:cs="Calibri"/>
-          <w:color w:val="2E5C8A"/>
-          <w:spacing w:val="16"/>
-          <w:sz w:val="19"/>
-          <w:szCs w:val="19"/>
-        </w:rPr>
-        <w:t>Frontend Development</w:t>
+        <w:t>Agentic AI ·  Conversational AI  ·  Gen AI  ·  Full Stack Engineering</w:t>
       </w:r>
     </w:p>
     <w:p>
@@ -97,6 +57,26 @@
         </w:rPr>
         <w:t>+1 (509) 296-9249     |     arnav.jaina25@gmail.com     |     Atlanta Metro, GA</w:t>
       </w:r>
+      <w:r>
+        <w:rPr>
+          <w:rFonts w:ascii="Calibri" w:eastAsia="Calibri" w:hAnsi="Calibri" w:cs="Calibri"/>
+          <w:color w:val="595959"/>
+          <w:sz w:val="18"/>
+          <w:szCs w:val="18"/>
+        </w:rPr>
+        <w:t xml:space="preserve">     |     </w:t>
+      </w:r>
+      <w:hyperlink r:id="rId7" w:history="1">
+        <w:r>
+          <w:rPr>
+            <w:rStyle w:val="Hyperlink"/>
+            <w:rFonts w:ascii="Calibri" w:eastAsia="Calibri" w:hAnsi="Calibri" w:cs="Calibri"/>
+            <w:sz w:val="18"/>
+            <w:szCs w:val="18"/>
+          </w:rPr>
+          <w:t>LinkedIn Link Here</w:t>
+        </w:r>
+      </w:hyperlink>
     </w:p>
     <w:p>
       <w:pPr>
@@ -104,7 +84,7 @@
         <w:pBdr>
           <w:bottom w:val="single" w:sz="8" w:space="3" w:color="1F3864"/>
         </w:pBdr>
-        <w:spacing w:before="200" w:after="80"/>
+        <w:spacing w:before="150" w:after="70"/>
         <w:rPr>
           <w:rFonts w:ascii="Georgia" w:eastAsia="Georgia" w:hAnsi="Georgia" w:cs="Georgia"/>
           <w:b/>
@@ -122,7 +102,7 @@
         <w:pBdr>
           <w:bottom w:val="single" w:sz="8" w:space="3" w:color="1F3864"/>
         </w:pBdr>
-        <w:spacing w:before="200" w:after="80"/>
+        <w:spacing w:before="150" w:after="70"/>
       </w:pPr>
       <w:r>
         <w:rPr>
@@ -139,104 +119,42 @@
     </w:p>
     <w:p>
       <w:pPr>
-        <w:spacing w:after="80" w:line="256" w:lineRule="auto"/>
-        <w:jc w:val="both"/>
-      </w:pPr>
-      <w:r>
-        <w:rPr>
-          <w:rFonts w:ascii="Calibri" w:eastAsia="Calibri" w:hAnsi="Calibri" w:cs="Calibri"/>
-          <w:color w:val="1A1A1A"/>
-          <w:sz w:val="19"/>
-          <w:szCs w:val="19"/>
-        </w:rPr>
-        <w:t>Senior AI Engineer</w:t>
-      </w:r>
-      <w:r>
-        <w:rPr>
-          <w:rFonts w:ascii="Calibri" w:eastAsia="Calibri" w:hAnsi="Calibri" w:cs="Calibri"/>
-          <w:color w:val="1A1A1A"/>
-          <w:sz w:val="19"/>
-          <w:szCs w:val="19"/>
-        </w:rPr>
-        <w:t xml:space="preserve"> &amp; Frontend Developer</w:t>
-      </w:r>
-      <w:r>
-        <w:rPr>
-          <w:rFonts w:ascii="Calibri" w:eastAsia="Calibri" w:hAnsi="Calibri" w:cs="Calibri"/>
-          <w:color w:val="1A1A1A"/>
-          <w:sz w:val="19"/>
-          <w:szCs w:val="19"/>
-        </w:rPr>
-        <w:t xml:space="preserve"> with 5+ years across AI engineering and production frontend development, specializing in Conversational AI, Agentic AI, and LLM-powered interactive applications. Design</w:t>
-      </w:r>
-      <w:r>
-        <w:rPr>
-          <w:rFonts w:ascii="Calibri" w:eastAsia="Calibri" w:hAnsi="Calibri" w:cs="Calibri"/>
-          <w:color w:val="1A1A1A"/>
-          <w:sz w:val="19"/>
-          <w:szCs w:val="19"/>
-        </w:rPr>
-        <w:t>ed</w:t>
-      </w:r>
-      <w:r>
-        <w:rPr>
-          <w:rFonts w:ascii="Calibri" w:eastAsia="Calibri" w:hAnsi="Calibri" w:cs="Calibri"/>
-          <w:color w:val="1A1A1A"/>
-          <w:sz w:val="19"/>
-          <w:szCs w:val="19"/>
-        </w:rPr>
-        <w:t xml:space="preserve"> multi-turn </w:t>
-      </w:r>
-      <w:r>
-        <w:rPr>
-          <w:rFonts w:ascii="Calibri" w:eastAsia="Calibri" w:hAnsi="Calibri" w:cs="Calibri"/>
-          <w:color w:val="1A1A1A"/>
-          <w:sz w:val="19"/>
-          <w:szCs w:val="19"/>
-        </w:rPr>
-        <w:t>AI-User</w:t>
-      </w:r>
-      <w:r>
-        <w:rPr>
-          <w:rFonts w:ascii="Calibri" w:eastAsia="Calibri" w:hAnsi="Calibri" w:cs="Calibri"/>
-          <w:color w:val="1A1A1A"/>
-          <w:sz w:val="19"/>
-          <w:szCs w:val="19"/>
-        </w:rPr>
-        <w:t xml:space="preserve"> experiences, agent workflows, prompt engineering frameworks, and human-in-the-loop decision workflows that translate complex, regulated business processes into transparent AI interactions guiding users through actions, approvals, and outcomes.</w:t>
-      </w:r>
-    </w:p>
-    <w:p>
-      <w:pPr>
-        <w:spacing w:after="40" w:line="256" w:lineRule="auto"/>
-        <w:jc w:val="both"/>
-      </w:pPr>
-      <w:r>
-        <w:rPr>
-          <w:rFonts w:ascii="Calibri" w:eastAsia="Calibri" w:hAnsi="Calibri" w:cs="Calibri"/>
-          <w:color w:val="1A1A1A"/>
-          <w:sz w:val="19"/>
-          <w:szCs w:val="19"/>
-        </w:rPr>
-        <w:t xml:space="preserve">Combine that depth with hands-on React and TypeScript engineering, building responsive, component-based interfaces that surface agent activity, capture user input, and present clear outcome states. Works directly alongside UI/UX and conversation designers to deliver AI </w:t>
-      </w:r>
-      <w:r>
-        <w:rPr>
-          <w:rFonts w:ascii="Calibri" w:eastAsia="Calibri" w:hAnsi="Calibri" w:cs="Calibri"/>
-          <w:color w:val="1A1A1A"/>
-          <w:sz w:val="19"/>
-          <w:szCs w:val="19"/>
-        </w:rPr>
-        <w:t>experiences</w:t>
-      </w:r>
-      <w:r>
-        <w:rPr>
-          <w:rFonts w:ascii="Calibri" w:eastAsia="Calibri" w:hAnsi="Calibri" w:cs="Calibri"/>
-          <w:color w:val="1A1A1A"/>
-          <w:sz w:val="19"/>
-          <w:szCs w:val="19"/>
-        </w:rPr>
-        <w:t xml:space="preserve"> with a consistent focus on explainability, conversation quality, and usability.</w:t>
+        <w:spacing w:after="80" w:line="254" w:lineRule="auto"/>
+        <w:rPr>
+          <w:rFonts w:ascii="Calibri" w:eastAsia="Calibri" w:hAnsi="Calibri" w:cs="Calibri"/>
+          <w:color w:val="1A1A1A"/>
+          <w:sz w:val="19"/>
+          <w:szCs w:val="19"/>
+        </w:rPr>
+      </w:pPr>
+      <w:r>
+        <w:rPr>
+          <w:rFonts w:ascii="Calibri" w:eastAsia="Calibri" w:hAnsi="Calibri" w:cs="Calibri"/>
+          <w:color w:val="1A1A1A"/>
+          <w:sz w:val="19"/>
+          <w:szCs w:val="19"/>
+        </w:rPr>
+        <w:t>Senior AI Full Stack Engineer with 6+ years of experience across building production-grade AI products and enterprise applications end to end—from agent and conversation design to Python/FastAPI services and React/TypeScript interfaces. Specializes in agentic AI, conversational systems, RAG, structured tool calling, and multi-step AI workflows, with a focus on building systems that are reliable, explainable, and human-supervised.</w:t>
+      </w:r>
+    </w:p>
+    <w:p>
+      <w:pPr>
+        <w:spacing w:after="80" w:line="254" w:lineRule="auto"/>
+        <w:rPr>
+          <w:rFonts w:ascii="Calibri" w:eastAsia="Calibri" w:hAnsi="Calibri" w:cs="Calibri"/>
+          <w:color w:val="1A1A1A"/>
+          <w:sz w:val="19"/>
+          <w:szCs w:val="19"/>
+        </w:rPr>
+      </w:pPr>
+      <w:r>
+        <w:rPr>
+          <w:rFonts w:ascii="Calibri" w:eastAsia="Calibri" w:hAnsi="Calibri" w:cs="Calibri"/>
+          <w:color w:val="1A1A1A"/>
+          <w:sz w:val="19"/>
+          <w:szCs w:val="19"/>
+        </w:rPr>
+        <w:t>Proven experience delivering AI solutions across telecom, enterprise procurement, and B2B SaaS, including agentic platforms that automate complex workflows and support human-in-the-loop workflows. Comprehensive expertise in LLM orchestration, prompt engineering, evaluation, retrieval, backend services, and frontend product development to turn AI capabilities into usable, production-ready products.</w:t>
       </w:r>
     </w:p>
     <w:p>
@@ -245,7 +163,7 @@
         <w:pBdr>
           <w:bottom w:val="single" w:sz="8" w:space="3" w:color="1F3864"/>
         </w:pBdr>
-        <w:spacing w:before="200" w:after="80"/>
+        <w:spacing w:before="150" w:after="70"/>
       </w:pPr>
       <w:r>
         <w:rPr>
@@ -284,9 +202,9 @@
           <w:tcPr>
             <w:tcW w:w="3060" w:type="dxa"/>
             <w:tcMar>
-              <w:top w:w="48" w:type="dxa"/>
+              <w:top w:w="60" w:type="dxa"/>
               <w:left w:w="0" w:type="dxa"/>
-              <w:bottom w:w="48" w:type="dxa"/>
+              <w:bottom w:w="60" w:type="dxa"/>
               <w:right w:w="140" w:type="dxa"/>
             </w:tcMar>
           </w:tcPr>
@@ -311,9 +229,9 @@
           <w:tcPr>
             <w:tcW w:w="7740" w:type="dxa"/>
             <w:tcMar>
-              <w:top w:w="48" w:type="dxa"/>
+              <w:top w:w="60" w:type="dxa"/>
               <w:left w:w="0" w:type="dxa"/>
-              <w:bottom w:w="48" w:type="dxa"/>
+              <w:bottom w:w="60" w:type="dxa"/>
               <w:right w:w="0" w:type="dxa"/>
             </w:tcMar>
           </w:tcPr>
@@ -328,7 +246,43 @@
                 <w:sz w:val="19"/>
                 <w:szCs w:val="19"/>
               </w:rPr>
-              <w:t>Conversational AI, Agentic AI, LLM Applications, Multi-turn Dialogue Orchestration, Conversation State Management, Agent Workflow Design, Tool / Function Calling, Human-in-the-Loop AI, Prompt Chaining, Context Management</w:t>
+              <w:t xml:space="preserve">Multi-turn </w:t>
+            </w:r>
+            <w:r>
+              <w:rPr>
+                <w:rFonts w:ascii="Calibri" w:eastAsia="Calibri" w:hAnsi="Calibri" w:cs="Calibri"/>
+                <w:color w:val="1A1A1A"/>
+                <w:sz w:val="19"/>
+                <w:szCs w:val="19"/>
+              </w:rPr>
+              <w:t>Agent</w:t>
+            </w:r>
+            <w:r>
+              <w:rPr>
+                <w:rFonts w:ascii="Calibri" w:eastAsia="Calibri" w:hAnsi="Calibri" w:cs="Calibri"/>
+                <w:color w:val="1A1A1A"/>
+                <w:sz w:val="19"/>
+                <w:szCs w:val="19"/>
+              </w:rPr>
+              <w:t xml:space="preserve"> Orchestration, Conversation State Management, Agent Workflow Design, Tool / Function Calling, Human-in-the-Loo</w:t>
+            </w:r>
+            <w:r>
+              <w:rPr>
+                <w:rFonts w:ascii="Calibri" w:eastAsia="Calibri" w:hAnsi="Calibri" w:cs="Calibri"/>
+                <w:color w:val="1A1A1A"/>
+                <w:sz w:val="19"/>
+                <w:szCs w:val="19"/>
+              </w:rPr>
+              <w:t>p</w:t>
+            </w:r>
+            <w:r>
+              <w:rPr>
+                <w:rFonts w:ascii="Calibri" w:eastAsia="Calibri" w:hAnsi="Calibri" w:cs="Calibri"/>
+                <w:color w:val="1A1A1A"/>
+                <w:sz w:val="19"/>
+                <w:szCs w:val="19"/>
+              </w:rPr>
+              <w:t>, Decision Workflows, Prompt Chaining, Context Management</w:t>
             </w:r>
           </w:p>
         </w:tc>
@@ -341,9 +295,9 @@
           <w:tcPr>
             <w:tcW w:w="3060" w:type="dxa"/>
             <w:tcMar>
-              <w:top w:w="48" w:type="dxa"/>
+              <w:top w:w="60" w:type="dxa"/>
               <w:left w:w="0" w:type="dxa"/>
-              <w:bottom w:w="48" w:type="dxa"/>
+              <w:bottom w:w="60" w:type="dxa"/>
               <w:right w:w="140" w:type="dxa"/>
             </w:tcMar>
           </w:tcPr>
@@ -368,9 +322,9 @@
           <w:tcPr>
             <w:tcW w:w="7740" w:type="dxa"/>
             <w:tcMar>
-              <w:top w:w="48" w:type="dxa"/>
+              <w:top w:w="60" w:type="dxa"/>
               <w:left w:w="0" w:type="dxa"/>
-              <w:bottom w:w="48" w:type="dxa"/>
+              <w:bottom w:w="60" w:type="dxa"/>
               <w:right w:w="0" w:type="dxa"/>
             </w:tcMar>
           </w:tcPr>
@@ -385,7 +339,43 @@
                 <w:sz w:val="19"/>
                 <w:szCs w:val="19"/>
               </w:rPr>
-              <w:t>LLMs, Prompt Engineering, LLM Evaluation, Response Grounding, Contextual Reasoning, Hallucination Detection &amp; Mitigation, Retrieval-Augmented Generation (RAG)</w:t>
+              <w:t>LLMs (GPT, Gemin</w:t>
+            </w:r>
+            <w:r>
+              <w:rPr>
+                <w:rFonts w:ascii="Calibri" w:eastAsia="Calibri" w:hAnsi="Calibri" w:cs="Calibri"/>
+                <w:color w:val="1A1A1A"/>
+                <w:sz w:val="19"/>
+                <w:szCs w:val="19"/>
+              </w:rPr>
+              <w:t>i</w:t>
+            </w:r>
+            <w:r>
+              <w:rPr>
+                <w:rFonts w:ascii="Calibri" w:eastAsia="Calibri" w:hAnsi="Calibri" w:cs="Calibri"/>
+                <w:color w:val="1A1A1A"/>
+                <w:sz w:val="19"/>
+                <w:szCs w:val="19"/>
+              </w:rPr>
+              <w:t>,</w:t>
+            </w:r>
+            <w:r>
+              <w:rPr>
+                <w:rFonts w:ascii="Calibri" w:eastAsia="Calibri" w:hAnsi="Calibri" w:cs="Calibri"/>
+                <w:color w:val="1A1A1A"/>
+                <w:sz w:val="19"/>
+                <w:szCs w:val="19"/>
+              </w:rPr>
+              <w:t xml:space="preserve"> Grok, Opus / Sonnet, etc.</w:t>
+            </w:r>
+            <w:r>
+              <w:rPr>
+                <w:rFonts w:ascii="Calibri" w:eastAsia="Calibri" w:hAnsi="Calibri" w:cs="Calibri"/>
+                <w:color w:val="1A1A1A"/>
+                <w:sz w:val="19"/>
+                <w:szCs w:val="19"/>
+              </w:rPr>
+              <w:t>), Prompt Engineering, LLM Evaluation, Contextual Reasoning, Hallucination Detection &amp; Mitigation, Retrieval-Augmented Generation (RAG)</w:t>
             </w:r>
           </w:p>
         </w:tc>
@@ -398,9 +388,9 @@
           <w:tcPr>
             <w:tcW w:w="3060" w:type="dxa"/>
             <w:tcMar>
-              <w:top w:w="48" w:type="dxa"/>
+              <w:top w:w="60" w:type="dxa"/>
               <w:left w:w="0" w:type="dxa"/>
-              <w:bottom w:w="48" w:type="dxa"/>
+              <w:bottom w:w="60" w:type="dxa"/>
               <w:right w:w="140" w:type="dxa"/>
             </w:tcMar>
           </w:tcPr>
@@ -425,9 +415,9 @@
           <w:tcPr>
             <w:tcW w:w="7740" w:type="dxa"/>
             <w:tcMar>
-              <w:top w:w="48" w:type="dxa"/>
+              <w:top w:w="60" w:type="dxa"/>
               <w:left w:w="0" w:type="dxa"/>
-              <w:bottom w:w="48" w:type="dxa"/>
+              <w:bottom w:w="60" w:type="dxa"/>
               <w:right w:w="0" w:type="dxa"/>
             </w:tcMar>
           </w:tcPr>
@@ -455,9 +445,9 @@
           <w:tcPr>
             <w:tcW w:w="3060" w:type="dxa"/>
             <w:tcMar>
-              <w:top w:w="48" w:type="dxa"/>
+              <w:top w:w="60" w:type="dxa"/>
               <w:left w:w="0" w:type="dxa"/>
-              <w:bottom w:w="48" w:type="dxa"/>
+              <w:bottom w:w="60" w:type="dxa"/>
               <w:right w:w="140" w:type="dxa"/>
             </w:tcMar>
           </w:tcPr>
@@ -474,7 +464,7 @@
                 <w:sz w:val="19"/>
                 <w:szCs w:val="19"/>
               </w:rPr>
-              <w:t>Frontend Engineering &amp; Design</w:t>
+              <w:t>Frontend Engineering</w:t>
             </w:r>
           </w:p>
         </w:tc>
@@ -482,9 +472,9 @@
           <w:tcPr>
             <w:tcW w:w="7740" w:type="dxa"/>
             <w:tcMar>
-              <w:top w:w="48" w:type="dxa"/>
+              <w:top w:w="60" w:type="dxa"/>
               <w:left w:w="0" w:type="dxa"/>
-              <w:bottom w:w="48" w:type="dxa"/>
+              <w:bottom w:w="60" w:type="dxa"/>
               <w:right w:w="0" w:type="dxa"/>
             </w:tcMar>
           </w:tcPr>
@@ -499,7 +489,7 @@
                 <w:sz w:val="19"/>
                 <w:szCs w:val="19"/>
               </w:rPr>
-              <w:t>React, TypeScript, JavaScript, HTML5, CSS3, Responsive UI, Component-Based Architecture, State Management, REST API Integration, Interaction Design, Human-in-the-Loop UX, Explainable AI Interactions, Figma, Design Systems</w:t>
+              <w:t>React, TypeScript, JavaScript, HTML5, CSS3, Component-Based Architecture, State Management, Responsive UI, REST API Integration, AI-Powered UI Development</w:t>
             </w:r>
           </w:p>
         </w:tc>
@@ -512,9 +502,9 @@
           <w:tcPr>
             <w:tcW w:w="3060" w:type="dxa"/>
             <w:tcMar>
-              <w:top w:w="48" w:type="dxa"/>
+              <w:top w:w="60" w:type="dxa"/>
               <w:left w:w="0" w:type="dxa"/>
-              <w:bottom w:w="48" w:type="dxa"/>
+              <w:bottom w:w="60" w:type="dxa"/>
               <w:right w:w="140" w:type="dxa"/>
             </w:tcMar>
           </w:tcPr>
@@ -531,7 +521,7 @@
                 <w:sz w:val="19"/>
                 <w:szCs w:val="19"/>
               </w:rPr>
-              <w:t>Backend, Data &amp; Knowledge Systems</w:t>
+              <w:t>Product Design</w:t>
             </w:r>
           </w:p>
         </w:tc>
@@ -539,9 +529,9 @@
           <w:tcPr>
             <w:tcW w:w="7740" w:type="dxa"/>
             <w:tcMar>
-              <w:top w:w="48" w:type="dxa"/>
+              <w:top w:w="60" w:type="dxa"/>
               <w:left w:w="0" w:type="dxa"/>
-              <w:bottom w:w="48" w:type="dxa"/>
+              <w:bottom w:w="60" w:type="dxa"/>
               <w:right w:w="0" w:type="dxa"/>
             </w:tcMar>
           </w:tcPr>
@@ -556,7 +546,7 @@
                 <w:sz w:val="19"/>
                 <w:szCs w:val="19"/>
               </w:rPr>
-              <w:t>Python, FastAPI, Flask, REST / JSON APIs, Asynchronous Processing, Microservices, ChromaDB, Pinecone, FAISS, MongoDB, Embedding Models, Semantic Search, Document Chunking, Reranking</w:t>
+              <w:t>User Journey Mapping, Explainable AI Interactions, Figma, Design Systems</w:t>
             </w:r>
           </w:p>
         </w:tc>
@@ -569,9 +559,9 @@
           <w:tcPr>
             <w:tcW w:w="3060" w:type="dxa"/>
             <w:tcMar>
-              <w:top w:w="48" w:type="dxa"/>
+              <w:top w:w="60" w:type="dxa"/>
               <w:left w:w="0" w:type="dxa"/>
-              <w:bottom w:w="48" w:type="dxa"/>
+              <w:bottom w:w="60" w:type="dxa"/>
               <w:right w:w="140" w:type="dxa"/>
             </w:tcMar>
           </w:tcPr>
@@ -588,7 +578,7 @@
                 <w:sz w:val="19"/>
                 <w:szCs w:val="19"/>
               </w:rPr>
-              <w:t>Cloud &amp; Development Tools</w:t>
+              <w:t>Backend &amp; API Engineering</w:t>
             </w:r>
           </w:p>
         </w:tc>
@@ -596,9 +586,9 @@
           <w:tcPr>
             <w:tcW w:w="7740" w:type="dxa"/>
             <w:tcMar>
-              <w:top w:w="48" w:type="dxa"/>
+              <w:top w:w="60" w:type="dxa"/>
               <w:left w:w="0" w:type="dxa"/>
-              <w:bottom w:w="48" w:type="dxa"/>
+              <w:bottom w:w="60" w:type="dxa"/>
               <w:right w:w="0" w:type="dxa"/>
             </w:tcMar>
           </w:tcPr>
@@ -613,6 +603,138 @@
                 <w:sz w:val="19"/>
                 <w:szCs w:val="19"/>
               </w:rPr>
+              <w:t xml:space="preserve">Python, FastAPI, Flask, </w:t>
+            </w:r>
+            <w:r>
+              <w:rPr>
+                <w:rFonts w:ascii="Calibri" w:eastAsia="Calibri" w:hAnsi="Calibri" w:cs="Calibri"/>
+                <w:color w:val="1A1A1A"/>
+                <w:sz w:val="19"/>
+                <w:szCs w:val="19"/>
+              </w:rPr>
+              <w:t xml:space="preserve">Node.js, Express, </w:t>
+            </w:r>
+            <w:r>
+              <w:rPr>
+                <w:rFonts w:ascii="Calibri" w:eastAsia="Calibri" w:hAnsi="Calibri" w:cs="Calibri"/>
+                <w:color w:val="1A1A1A"/>
+                <w:sz w:val="19"/>
+                <w:szCs w:val="19"/>
+              </w:rPr>
+              <w:t>REST / JSON APIs, Microservices, Asynchronous Processing, Event-Driven Workflows</w:t>
+            </w:r>
+          </w:p>
+        </w:tc>
+      </w:tr>
+      <w:tr>
+        <w:trPr>
+          <w:cantSplit/>
+        </w:trPr>
+        <w:tc>
+          <w:tcPr>
+            <w:tcW w:w="3060" w:type="dxa"/>
+            <w:tcMar>
+              <w:top w:w="60" w:type="dxa"/>
+              <w:left w:w="0" w:type="dxa"/>
+              <w:bottom w:w="60" w:type="dxa"/>
+              <w:right w:w="140" w:type="dxa"/>
+            </w:tcMar>
+          </w:tcPr>
+          <w:p>
+            <w:pPr>
+              <w:spacing w:line="250" w:lineRule="auto"/>
+            </w:pPr>
+            <w:r>
+              <w:rPr>
+                <w:rFonts w:ascii="Calibri" w:eastAsia="Calibri" w:hAnsi="Calibri" w:cs="Calibri"/>
+                <w:b/>
+                <w:bCs/>
+                <w:color w:val="1F3864"/>
+                <w:sz w:val="19"/>
+                <w:szCs w:val="19"/>
+              </w:rPr>
+              <w:t>Data &amp; Knowledge Systems</w:t>
+            </w:r>
+          </w:p>
+        </w:tc>
+        <w:tc>
+          <w:tcPr>
+            <w:tcW w:w="7740" w:type="dxa"/>
+            <w:tcMar>
+              <w:top w:w="60" w:type="dxa"/>
+              <w:left w:w="0" w:type="dxa"/>
+              <w:bottom w:w="60" w:type="dxa"/>
+              <w:right w:w="0" w:type="dxa"/>
+            </w:tcMar>
+          </w:tcPr>
+          <w:p>
+            <w:pPr>
+              <w:spacing w:line="250" w:lineRule="auto"/>
+            </w:pPr>
+            <w:r>
+              <w:rPr>
+                <w:rFonts w:ascii="Calibri" w:eastAsia="Calibri" w:hAnsi="Calibri" w:cs="Calibri"/>
+                <w:color w:val="1A1A1A"/>
+                <w:sz w:val="19"/>
+                <w:szCs w:val="19"/>
+              </w:rPr>
+              <w:t>ChromaDB, Pinecone, FAISS, MongoDB, Vector Databases, Embedding Models, Semantic Search, Document Chunking, Reranking</w:t>
+            </w:r>
+          </w:p>
+        </w:tc>
+      </w:tr>
+      <w:tr>
+        <w:trPr>
+          <w:cantSplit/>
+        </w:trPr>
+        <w:tc>
+          <w:tcPr>
+            <w:tcW w:w="3060" w:type="dxa"/>
+            <w:tcMar>
+              <w:top w:w="60" w:type="dxa"/>
+              <w:left w:w="0" w:type="dxa"/>
+              <w:bottom w:w="60" w:type="dxa"/>
+              <w:right w:w="140" w:type="dxa"/>
+            </w:tcMar>
+          </w:tcPr>
+          <w:p>
+            <w:pPr>
+              <w:spacing w:line="250" w:lineRule="auto"/>
+            </w:pPr>
+            <w:r>
+              <w:rPr>
+                <w:rFonts w:ascii="Calibri" w:eastAsia="Calibri" w:hAnsi="Calibri" w:cs="Calibri"/>
+                <w:b/>
+                <w:bCs/>
+                <w:color w:val="1F3864"/>
+                <w:sz w:val="19"/>
+                <w:szCs w:val="19"/>
+              </w:rPr>
+              <w:t>Cloud &amp; Development Tools</w:t>
+            </w:r>
+          </w:p>
+        </w:tc>
+        <w:tc>
+          <w:tcPr>
+            <w:tcW w:w="7740" w:type="dxa"/>
+            <w:tcMar>
+              <w:top w:w="60" w:type="dxa"/>
+              <w:left w:w="0" w:type="dxa"/>
+              <w:bottom w:w="60" w:type="dxa"/>
+              <w:right w:w="0" w:type="dxa"/>
+            </w:tcMar>
+          </w:tcPr>
+          <w:p>
+            <w:pPr>
+              <w:spacing w:line="250" w:lineRule="auto"/>
+            </w:pPr>
+            <w:r>
+              <w:rPr>
+                <w:rFonts w:ascii="Calibri" w:eastAsia="Calibri" w:hAnsi="Calibri" w:cs="Calibri"/>
+                <w:color w:val="1A1A1A"/>
+                <w:sz w:val="19"/>
+                <w:szCs w:val="19"/>
+              </w:rPr>
               <w:t>AWS, Git, GitHub, Docker, Postman, VS Code, Claude Code, Cursor, Codex</w:t>
             </w:r>
           </w:p>
@@ -625,7 +747,7 @@
         <w:pBdr>
           <w:bottom w:val="single" w:sz="8" w:space="3" w:color="1F3864"/>
         </w:pBdr>
-        <w:spacing w:before="200" w:after="80"/>
+        <w:spacing w:before="150" w:after="70"/>
       </w:pPr>
       <w:r>
         <w:rPr>
@@ -646,7 +768,7 @@
         <w:tabs>
           <w:tab w:val="right" w:pos="10800"/>
         </w:tabs>
-        <w:spacing w:before="190"/>
+        <w:spacing w:before="140"/>
       </w:pPr>
       <w:r>
         <w:rPr>
@@ -697,7 +819,7 @@
           <w:iCs/>
           <w:color w:val="2E5C8A"/>
         </w:rPr>
-        <w:t>Senior AI Engineer — Agentic AI &amp; Enterprise Automation</w:t>
+        <w:t>Senior AI Full Stack Engineer — Agentic AI &amp; Enterprise Automation</w:t>
       </w:r>
     </w:p>
     <w:p>
@@ -735,25 +857,191 @@
           <w:sz w:val="19"/>
           <w:szCs w:val="19"/>
         </w:rPr>
-        <w:t>Architected LLM-powered</w:t>
-      </w:r>
-      <w:r>
-        <w:rPr>
-          <w:rFonts w:ascii="Calibri" w:eastAsia="Calibri" w:hAnsi="Calibri" w:cs="Calibri"/>
-          <w:color w:val="1A1A1A"/>
-          <w:sz w:val="19"/>
-          <w:szCs w:val="19"/>
-        </w:rPr>
-        <w:t xml:space="preserve"> (GPT-4o, Gemini 2.5 Pro)</w:t>
-      </w:r>
-      <w:r>
-        <w:rPr>
-          <w:rFonts w:ascii="Calibri" w:eastAsia="Calibri" w:hAnsi="Calibri" w:cs="Calibri"/>
-          <w:color w:val="1A1A1A"/>
-          <w:sz w:val="19"/>
-          <w:szCs w:val="19"/>
-        </w:rPr>
-        <w:t xml:space="preserve"> agent workflows using LangGraph/LangChain, structured tool calling, retrieval, business-rule validation, and stateful orchestration to support multi-step enterprise workflows.</w:t>
+        <w:t>Architected LLM-powered (GPT-4o, Gemini 2.5 Pro) agent workflows using LangGraph/LangChain, structured tool calling, retrieval, business-rule validation, and stateful orchestration to support multi-step enterprise workflows.</w:t>
+      </w:r>
+    </w:p>
+    <w:p>
+      <w:pPr>
+        <w:pStyle w:val="ListParagraph"/>
+        <w:numPr>
+          <w:ilvl w:val="0"/>
+          <w:numId w:val="2"/>
+        </w:numPr>
+        <w:spacing w:after="40" w:line="246" w:lineRule="auto"/>
+      </w:pPr>
+      <w:r>
+        <w:rPr>
+          <w:rFonts w:ascii="Calibri" w:eastAsia="Calibri" w:hAnsi="Calibri" w:cs="Calibri"/>
+          <w:color w:val="1A1A1A"/>
+          <w:sz w:val="19"/>
+          <w:szCs w:val="19"/>
+        </w:rPr>
+        <w:t xml:space="preserve">Designed human-in-the-loop checkpoints balancing automation with </w:t>
+      </w:r>
+      <w:r>
+        <w:rPr>
+          <w:rFonts w:ascii="Calibri" w:eastAsia="Calibri" w:hAnsi="Calibri" w:cs="Calibri"/>
+          <w:color w:val="1A1A1A"/>
+          <w:sz w:val="19"/>
+          <w:szCs w:val="19"/>
+        </w:rPr>
+        <w:t xml:space="preserve">human </w:t>
+      </w:r>
+      <w:r>
+        <w:rPr>
+          <w:rFonts w:ascii="Calibri" w:eastAsia="Calibri" w:hAnsi="Calibri" w:cs="Calibri"/>
+          <w:color w:val="1A1A1A"/>
+          <w:sz w:val="19"/>
+          <w:szCs w:val="19"/>
+        </w:rPr>
+        <w:t xml:space="preserve">intervention at the </w:t>
+      </w:r>
+      <w:r>
+        <w:rPr>
+          <w:rFonts w:ascii="Calibri" w:eastAsia="Calibri" w:hAnsi="Calibri" w:cs="Calibri"/>
+          <w:color w:val="1A1A1A"/>
+          <w:sz w:val="19"/>
+          <w:szCs w:val="19"/>
+        </w:rPr>
+        <w:t xml:space="preserve">critical </w:t>
+      </w:r>
+      <w:r>
+        <w:rPr>
+          <w:rFonts w:ascii="Calibri" w:eastAsia="Calibri" w:hAnsi="Calibri" w:cs="Calibri"/>
+          <w:color w:val="1A1A1A"/>
+          <w:sz w:val="19"/>
+          <w:szCs w:val="19"/>
+        </w:rPr>
+        <w:t>points in bid package generation.</w:t>
+      </w:r>
+    </w:p>
+    <w:p>
+      <w:pPr>
+        <w:pStyle w:val="ListParagraph"/>
+        <w:numPr>
+          <w:ilvl w:val="0"/>
+          <w:numId w:val="2"/>
+        </w:numPr>
+        <w:spacing w:after="40" w:line="246" w:lineRule="auto"/>
+      </w:pPr>
+      <w:r>
+        <w:rPr>
+          <w:rFonts w:ascii="Calibri" w:eastAsia="Calibri" w:hAnsi="Calibri" w:cs="Calibri"/>
+          <w:color w:val="1A1A1A"/>
+          <w:sz w:val="19"/>
+          <w:szCs w:val="19"/>
+        </w:rPr>
+        <w:t>Built API-first AI services in Python and FastAPI, integrating conversational capabilities with enterprise platforms, CRM systems, and internal knowledge repositories, improving the bid opportunities intake by 10-12%</w:t>
+      </w:r>
+    </w:p>
+    <w:p>
+      <w:pPr>
+        <w:pStyle w:val="ListParagraph"/>
+        <w:numPr>
+          <w:ilvl w:val="0"/>
+          <w:numId w:val="2"/>
+        </w:numPr>
+        <w:spacing w:after="40" w:line="246" w:lineRule="auto"/>
+      </w:pPr>
+      <w:r>
+        <w:rPr>
+          <w:rFonts w:ascii="Calibri" w:eastAsia="Calibri" w:hAnsi="Calibri" w:cs="Calibri"/>
+          <w:color w:val="1A1A1A"/>
+          <w:sz w:val="19"/>
+          <w:szCs w:val="19"/>
+        </w:rPr>
+        <w:t>Partnered with UI/UX designers to translate agent behavior, conversation flows, and decision states into trustworthy interactions, and built the corresponding React/TypeScript interfaces.</w:t>
+      </w:r>
+    </w:p>
+    <w:p>
+      <w:pPr>
+        <w:pStyle w:val="ListParagraph"/>
+        <w:numPr>
+          <w:ilvl w:val="0"/>
+          <w:numId w:val="2"/>
+        </w:numPr>
+        <w:spacing w:after="40" w:line="246" w:lineRule="auto"/>
+      </w:pPr>
+      <w:r>
+        <w:rPr>
+          <w:rFonts w:ascii="Calibri" w:eastAsia="Calibri" w:hAnsi="Calibri" w:cs="Calibri"/>
+          <w:color w:val="1A1A1A"/>
+          <w:sz w:val="19"/>
+          <w:szCs w:val="19"/>
+        </w:rPr>
+        <w:t>Evaluated single-agent, multi-agent, and retrieval-augmented architectures to determine the appropriate approach per use case, and contributed to solution architecture across AI integration patterns, API design, and asynchronous processing.</w:t>
+      </w:r>
+    </w:p>
+    <w:p>
+      <w:pPr>
+        <w:keepNext/>
+        <w:tabs>
+          <w:tab w:val="right" w:pos="10800"/>
+        </w:tabs>
+        <w:spacing w:before="140"/>
+      </w:pPr>
+      <w:r>
+        <w:rPr>
+          <w:rFonts w:ascii="Calibri" w:eastAsia="Calibri" w:hAnsi="Calibri" w:cs="Calibri"/>
+          <w:b/>
+          <w:bCs/>
+          <w:color w:val="1A1A1A"/>
+          <w:sz w:val="21"/>
+          <w:szCs w:val="21"/>
+        </w:rPr>
+        <w:lastRenderedPageBreak/>
+        <w:t>xAI</w:t>
+      </w:r>
+      <w:r>
+        <w:rPr>
+          <w:rFonts w:ascii="Calibri" w:eastAsia="Calibri" w:hAnsi="Calibri" w:cs="Calibri"/>
+          <w:color w:val="595959"/>
+          <w:sz w:val="19"/>
+          <w:szCs w:val="19"/>
+        </w:rPr>
+        <w:t xml:space="preserve">  |  Seattle, WA</w:t>
+      </w:r>
+      <w:r>
+        <w:tab/>
+      </w:r>
+      <w:r>
+        <w:rPr>
+          <w:rFonts w:ascii="Calibri" w:eastAsia="Calibri" w:hAnsi="Calibri" w:cs="Calibri"/>
+          <w:b/>
+          <w:bCs/>
+          <w:color w:val="1F3864"/>
+          <w:sz w:val="19"/>
+          <w:szCs w:val="19"/>
+        </w:rPr>
+        <w:t>Feb 2025 – Dec 2025</w:t>
+      </w:r>
+    </w:p>
+    <w:p>
+      <w:pPr>
+        <w:keepNext/>
+        <w:spacing w:before="20" w:after="80"/>
+      </w:pPr>
+      <w:r>
+        <w:rPr>
+          <w:rFonts w:ascii="Calibri" w:eastAsia="Calibri" w:hAnsi="Calibri" w:cs="Calibri"/>
+          <w:b/>
+          <w:bCs/>
+          <w:i/>
+          <w:iCs/>
+          <w:color w:val="2E5C8A"/>
+        </w:rPr>
+        <w:t xml:space="preserve">AI Engineer — </w:t>
+      </w:r>
+      <w:r>
+        <w:rPr>
+          <w:rFonts w:ascii="Calibri" w:eastAsia="Calibri" w:hAnsi="Calibri" w:cs="Calibri"/>
+          <w:b/>
+          <w:bCs/>
+          <w:i/>
+          <w:iCs/>
+          <w:color w:val="2E5C8A"/>
+        </w:rPr>
+        <w:t>LLM Evaluation &amp; Conversational AI</w:t>
       </w:r>
     </w:p>
     <w:p>
@@ -772,43 +1060,7 @@
           <w:sz w:val="19"/>
           <w:szCs w:val="19"/>
         </w:rPr>
-        <w:t>Designed human-in-the-loop workflows balancing automation with user review</w:t>
-      </w:r>
-      <w:r>
-        <w:rPr>
-          <w:rFonts w:ascii="Calibri" w:eastAsia="Calibri" w:hAnsi="Calibri" w:cs="Calibri"/>
-          <w:color w:val="1A1A1A"/>
-          <w:sz w:val="19"/>
-          <w:szCs w:val="19"/>
-        </w:rPr>
-        <w:t xml:space="preserve"> </w:t>
-      </w:r>
-      <w:r>
-        <w:rPr>
-          <w:rFonts w:ascii="Calibri" w:eastAsia="Calibri" w:hAnsi="Calibri" w:cs="Calibri"/>
-          <w:color w:val="1A1A1A"/>
-          <w:sz w:val="19"/>
-          <w:szCs w:val="19"/>
-        </w:rPr>
-        <w:t xml:space="preserve">and intervention at critical decision </w:t>
-      </w:r>
-      <w:r>
-        <w:rPr>
-          <w:rFonts w:ascii="Calibri" w:eastAsia="Calibri" w:hAnsi="Calibri" w:cs="Calibri"/>
-          <w:color w:val="1A1A1A"/>
-          <w:sz w:val="19"/>
-          <w:szCs w:val="19"/>
-        </w:rPr>
-        <w:t>points and</w:t>
-      </w:r>
-      <w:r>
-        <w:rPr>
-          <w:rFonts w:ascii="Calibri" w:eastAsia="Calibri" w:hAnsi="Calibri" w:cs="Calibri"/>
-          <w:color w:val="1A1A1A"/>
-          <w:sz w:val="19"/>
-          <w:szCs w:val="19"/>
-        </w:rPr>
-        <w:t xml:space="preserve"> developed reusable prompt templates and evaluation workflows that improved response quality and consistency.</w:t>
+        <w:t>Evaluated LLM behavior across complex multi-turn scenarios, assessing contextual reasoning, instruction following, dialogue coherence, and decision consistency; analyzed flows for ambiguity, intent recognition, context retention, and conversation breakdowns.</w:t>
       </w:r>
     </w:p>
     <w:p>
@@ -827,61 +1079,7 @@
           <w:sz w:val="19"/>
           <w:szCs w:val="19"/>
         </w:rPr>
-        <w:t>Developed API-first AI services in Python and FastAPI, integrating conversational AI with enterprise platforms</w:t>
-      </w:r>
-      <w:r>
-        <w:rPr>
-          <w:rFonts w:ascii="Calibri" w:eastAsia="Calibri" w:hAnsi="Calibri" w:cs="Calibri"/>
-          <w:color w:val="1A1A1A"/>
-          <w:sz w:val="19"/>
-          <w:szCs w:val="19"/>
-        </w:rPr>
-        <w:t xml:space="preserve"> like HigherGov</w:t>
-      </w:r>
-      <w:r>
-        <w:rPr>
-          <w:rFonts w:ascii="Calibri" w:eastAsia="Calibri" w:hAnsi="Calibri" w:cs="Calibri"/>
-          <w:color w:val="1A1A1A"/>
-          <w:sz w:val="19"/>
-          <w:szCs w:val="19"/>
-        </w:rPr>
-        <w:t>,</w:t>
-      </w:r>
-      <w:r>
-        <w:rPr>
-          <w:rFonts w:ascii="Calibri" w:eastAsia="Calibri" w:hAnsi="Calibri" w:cs="Calibri"/>
-          <w:color w:val="1A1A1A"/>
-          <w:sz w:val="19"/>
-          <w:szCs w:val="19"/>
-        </w:rPr>
-        <w:t xml:space="preserve"> etc.,</w:t>
-      </w:r>
-      <w:r>
-        <w:rPr>
-          <w:rFonts w:ascii="Calibri" w:eastAsia="Calibri" w:hAnsi="Calibri" w:cs="Calibri"/>
-          <w:color w:val="1A1A1A"/>
-          <w:sz w:val="19"/>
-          <w:szCs w:val="19"/>
-        </w:rPr>
-        <w:t xml:space="preserve"> REST APIs, CRM systems</w:t>
-      </w:r>
-      <w:r>
-        <w:rPr>
-          <w:rFonts w:ascii="Calibri" w:eastAsia="Calibri" w:hAnsi="Calibri" w:cs="Calibri"/>
-          <w:color w:val="1A1A1A"/>
-          <w:sz w:val="19"/>
-          <w:szCs w:val="19"/>
-        </w:rPr>
-        <w:t xml:space="preserve"> like HubSpot, etc.</w:t>
-      </w:r>
-      <w:r>
-        <w:rPr>
-          <w:rFonts w:ascii="Calibri" w:eastAsia="Calibri" w:hAnsi="Calibri" w:cs="Calibri"/>
-          <w:color w:val="1A1A1A"/>
-          <w:sz w:val="19"/>
-          <w:szCs w:val="19"/>
-        </w:rPr>
-        <w:t>, and internal knowledge repositories.</w:t>
+        <w:t>Built evaluation datasets and testing frameworks measuring response quality, factual grounding, hallucination rates, and task completion, and evaluated agents across multi-step planning and tool-use scenarios.</w:t>
       </w:r>
     </w:p>
     <w:p>
@@ -900,78 +1098,7 @@
           <w:sz w:val="19"/>
           <w:szCs w:val="19"/>
         </w:rPr>
-        <w:t>Partnered with UI/UX designers to translate agent behavior, conversation flows, and decision states into intuitive interactions, and built the corresponding React/TypeScript interfaces.</w:t>
-      </w:r>
-    </w:p>
-    <w:p>
-      <w:pPr>
-        <w:keepNext/>
-        <w:tabs>
-          <w:tab w:val="right" w:pos="10800"/>
-        </w:tabs>
-        <w:spacing w:before="190"/>
-      </w:pPr>
-      <w:r>
-        <w:rPr>
-          <w:rFonts w:ascii="Calibri" w:eastAsia="Calibri" w:hAnsi="Calibri" w:cs="Calibri"/>
-          <w:b/>
-          <w:bCs/>
-          <w:color w:val="1A1A1A"/>
-          <w:sz w:val="21"/>
-          <w:szCs w:val="21"/>
-        </w:rPr>
-        <w:t>xAI (Twitter)</w:t>
-      </w:r>
-      <w:r>
-        <w:rPr>
-          <w:rFonts w:ascii="Calibri" w:eastAsia="Calibri" w:hAnsi="Calibri" w:cs="Calibri"/>
-          <w:color w:val="595959"/>
-          <w:sz w:val="19"/>
-          <w:szCs w:val="19"/>
-        </w:rPr>
-        <w:t xml:space="preserve">  |  Seattle, WA</w:t>
-      </w:r>
-      <w:r>
-        <w:tab/>
-      </w:r>
-      <w:r>
-        <w:rPr>
-          <w:rFonts w:ascii="Calibri" w:eastAsia="Calibri" w:hAnsi="Calibri" w:cs="Calibri"/>
-          <w:b/>
-          <w:bCs/>
-          <w:color w:val="1F3864"/>
-          <w:sz w:val="19"/>
-          <w:szCs w:val="19"/>
-        </w:rPr>
-        <w:t>Jan</w:t>
-      </w:r>
-      <w:r>
-        <w:rPr>
-          <w:rFonts w:ascii="Calibri" w:eastAsia="Calibri" w:hAnsi="Calibri" w:cs="Calibri"/>
-          <w:b/>
-          <w:bCs/>
-          <w:color w:val="1F3864"/>
-          <w:sz w:val="19"/>
-          <w:szCs w:val="19"/>
-        </w:rPr>
-        <w:t xml:space="preserve"> 2025 – Dec 2025</w:t>
-      </w:r>
-    </w:p>
-    <w:p>
-      <w:pPr>
-        <w:keepNext/>
-        <w:spacing w:before="20" w:after="80"/>
-      </w:pPr>
-      <w:r>
-        <w:rPr>
-          <w:rFonts w:ascii="Calibri" w:eastAsia="Calibri" w:hAnsi="Calibri" w:cs="Calibri"/>
-          <w:b/>
-          <w:bCs/>
-          <w:i/>
-          <w:iCs/>
-          <w:color w:val="2E5C8A"/>
-        </w:rPr>
-        <w:t>AI Engineer — LLM Evaluation &amp; Conversational AI</w:t>
+        <w:t>Designed prompt engineering strategies and reusable conversational interaction patterns that improved conversational quality and consistency across AI use cases while preserving flexibility for diverse user paths.</w:t>
       </w:r>
     </w:p>
     <w:p>
@@ -990,7 +1117,7 @@
           <w:sz w:val="19"/>
           <w:szCs w:val="19"/>
         </w:rPr>
-        <w:t>Evaluated LLM behavior across complex multi-turn scenarios, assessing contextual reasoning, instruction following, dialogue coherence, and decision consistency; analyzed flows for ambiguity, intent recognition, context retention, and conversation breakdowns.</w:t>
+        <w:t>Collaborated with research teams to improve model grounding and reduce hallucinations, and documented AI design guidelines, prompt practices, and evaluation methodologies for use across teams.</w:t>
       </w:r>
     </w:p>
     <w:p>
@@ -1009,7 +1136,124 @@
           <w:sz w:val="19"/>
           <w:szCs w:val="19"/>
         </w:rPr>
-        <w:t>Built evaluation datasets and testing frameworks measuring response quality, factual grounding, hallucination rates, and task completion, and evaluated agents across multi-step planning and tool-use scenarios.</w:t>
+        <w:t>Analyzed Human-AI transcripts and model outputs to identify ambiguity, failed intents, context loss, unsupported responses, and other interaction-level failure modes, translating findings into model and prompt improvements.</w:t>
+      </w:r>
+    </w:p>
+    <w:p>
+      <w:pPr>
+        <w:pStyle w:val="ListParagraph"/>
+        <w:numPr>
+          <w:ilvl w:val="0"/>
+          <w:numId w:val="2"/>
+        </w:numPr>
+        <w:spacing w:after="40" w:line="246" w:lineRule="auto"/>
+      </w:pPr>
+      <w:r>
+        <w:rPr>
+          <w:rFonts w:ascii="Calibri" w:eastAsia="Calibri" w:hAnsi="Calibri" w:cs="Calibri"/>
+          <w:color w:val="1A1A1A"/>
+          <w:sz w:val="19"/>
+          <w:szCs w:val="19"/>
+        </w:rPr>
+        <w:t>Worked on building an agentic incident-response platform for security operations end to end: the agent investigates an anomaly, executes tool calls, builds an evidence-backed hypothesis, and proposes an action inside a conversation-first workspace, processing incidents roughly 20% faster than the prior workflows.</w:t>
+      </w:r>
+    </w:p>
+    <w:p>
+      <w:pPr>
+        <w:pStyle w:val="ListParagraph"/>
+        <w:numPr>
+          <w:ilvl w:val="0"/>
+          <w:numId w:val="2"/>
+        </w:numPr>
+        <w:spacing w:after="40" w:line="246" w:lineRule="auto"/>
+      </w:pPr>
+      <w:r>
+        <w:rPr>
+          <w:rFonts w:ascii="Calibri" w:eastAsia="Calibri" w:hAnsi="Calibri" w:cs="Calibri"/>
+          <w:color w:val="1A1A1A"/>
+          <w:sz w:val="19"/>
+          <w:szCs w:val="19"/>
+        </w:rPr>
+        <w:t>Delivered the full incident-response workflow covering both the Python/FastAPI services and the React/TypeScript interfaces.</w:t>
+      </w:r>
+    </w:p>
+    <w:p>
+      <w:pPr>
+        <w:keepNext/>
+        <w:tabs>
+          <w:tab w:val="right" w:pos="10800"/>
+        </w:tabs>
+        <w:spacing w:before="140"/>
+      </w:pPr>
+      <w:r>
+        <w:rPr>
+          <w:rFonts w:ascii="Calibri" w:eastAsia="Calibri" w:hAnsi="Calibri" w:cs="Calibri"/>
+          <w:b/>
+          <w:bCs/>
+          <w:color w:val="1A1A1A"/>
+          <w:sz w:val="21"/>
+          <w:szCs w:val="21"/>
+        </w:rPr>
+        <w:t>Washington State University</w:t>
+      </w:r>
+      <w:r>
+        <w:rPr>
+          <w:rFonts w:ascii="Calibri" w:eastAsia="Calibri" w:hAnsi="Calibri" w:cs="Calibri"/>
+          <w:color w:val="595959"/>
+          <w:sz w:val="19"/>
+          <w:szCs w:val="19"/>
+        </w:rPr>
+        <w:t xml:space="preserve">  |  Pullman, WA</w:t>
+      </w:r>
+      <w:r>
+        <w:tab/>
+      </w:r>
+      <w:r>
+        <w:rPr>
+          <w:rFonts w:ascii="Calibri" w:eastAsia="Calibri" w:hAnsi="Calibri" w:cs="Calibri"/>
+          <w:b/>
+          <w:bCs/>
+          <w:color w:val="1F3864"/>
+          <w:sz w:val="19"/>
+          <w:szCs w:val="19"/>
+        </w:rPr>
+        <w:t>Jan 2023 – Dec 2024</w:t>
+      </w:r>
+    </w:p>
+    <w:p>
+      <w:pPr>
+        <w:keepNext/>
+        <w:spacing w:before="20" w:after="80"/>
+      </w:pPr>
+      <w:r>
+        <w:rPr>
+          <w:rFonts w:ascii="Calibri" w:eastAsia="Calibri" w:hAnsi="Calibri" w:cs="Calibri"/>
+          <w:b/>
+          <w:bCs/>
+          <w:i/>
+          <w:iCs/>
+          <w:color w:val="2E5C8A"/>
+        </w:rPr>
+        <w:t>Full Stack Engineer — AI &amp; Analytics Platform</w:t>
+      </w:r>
+    </w:p>
+    <w:p>
+      <w:pPr>
+        <w:pStyle w:val="ListParagraph"/>
+        <w:numPr>
+          <w:ilvl w:val="0"/>
+          <w:numId w:val="2"/>
+        </w:numPr>
+        <w:spacing w:after="46" w:line="250" w:lineRule="auto"/>
+      </w:pPr>
+      <w:r>
+        <w:rPr>
+          <w:rFonts w:ascii="Calibri" w:eastAsia="Calibri" w:hAnsi="Calibri" w:cs="Calibri"/>
+          <w:color w:val="1A1A1A"/>
+          <w:sz w:val="19"/>
+          <w:szCs w:val="19"/>
+        </w:rPr>
+        <w:t>Built the client-facing web application for an analytics and AI platform, plus the Python backend services and FastAPI microservices behind it supporting analytics, AI-driven data processing, and NLP workflows.</w:t>
       </w:r>
     </w:p>
     <w:p>
@@ -1028,8 +1272,7 @@
           <w:sz w:val="19"/>
           <w:szCs w:val="19"/>
         </w:rPr>
-        <w:lastRenderedPageBreak/>
-        <w:t>Designed prompt engineering strategies and reusable conversational interaction patterns that improved conversational quality and consistency across AI use cases while preserving flexibility for diverse user paths.</w:t>
+        <w:t>Developed interactive data views for users to explore analytics results and AI-generated outputs.</w:t>
       </w:r>
     </w:p>
     <w:p>
@@ -1039,16 +1282,76 @@
           <w:ilvl w:val="0"/>
           <w:numId w:val="2"/>
         </w:numPr>
-        <w:spacing w:after="42" w:line="248" w:lineRule="auto"/>
-      </w:pPr>
-      <w:r>
-        <w:rPr>
-          <w:rFonts w:ascii="Calibri" w:eastAsia="Calibri" w:hAnsi="Calibri" w:cs="Calibri"/>
-          <w:color w:val="1A1A1A"/>
-          <w:sz w:val="19"/>
-          <w:szCs w:val="19"/>
-        </w:rPr>
-        <w:t>Collaborated with research teams to improve model grounding and reduce hallucinations, and documented AI design guidelines, prompt practices, and evaluation methodologies for use across teams.</w:t>
+        <w:spacing w:after="40" w:line="246" w:lineRule="auto"/>
+      </w:pPr>
+      <w:r>
+        <w:rPr>
+          <w:rFonts w:ascii="Calibri" w:eastAsia="Calibri" w:hAnsi="Calibri" w:cs="Calibri"/>
+          <w:color w:val="1A1A1A"/>
+          <w:sz w:val="19"/>
+          <w:szCs w:val="19"/>
+        </w:rPr>
+        <w:t>Built NLP preprocessing and data pipelines covering tokenization, text normalization, feature extraction, and validation, with structured logging, monitoring, retry mechanisms, and fault-tolerant processing throughout.</w:t>
+      </w:r>
+    </w:p>
+    <w:p>
+      <w:pPr>
+        <w:keepNext/>
+        <w:tabs>
+          <w:tab w:val="right" w:pos="10800"/>
+        </w:tabs>
+        <w:spacing w:before="140"/>
+      </w:pPr>
+      <w:r>
+        <w:rPr>
+          <w:rFonts w:ascii="Calibri" w:eastAsia="Calibri" w:hAnsi="Calibri" w:cs="Calibri"/>
+          <w:b/>
+          <w:bCs/>
+          <w:color w:val="1A1A1A"/>
+          <w:sz w:val="21"/>
+          <w:szCs w:val="21"/>
+        </w:rPr>
+        <w:t>Deloitte</w:t>
+      </w:r>
+      <w:r>
+        <w:rPr>
+          <w:rFonts w:ascii="Calibri" w:eastAsia="Calibri" w:hAnsi="Calibri" w:cs="Calibri"/>
+          <w:color w:val="595959"/>
+          <w:sz w:val="19"/>
+          <w:szCs w:val="19"/>
+        </w:rPr>
+        <w:t xml:space="preserve">  |  India</w:t>
+      </w:r>
+      <w:r>
+        <w:tab/>
+      </w:r>
+      <w:r>
+        <w:rPr>
+          <w:rFonts w:ascii="Calibri" w:eastAsia="Calibri" w:hAnsi="Calibri" w:cs="Calibri"/>
+          <w:b/>
+          <w:bCs/>
+          <w:color w:val="1F3864"/>
+          <w:sz w:val="19"/>
+          <w:szCs w:val="19"/>
+        </w:rPr>
+        <w:t>Sep 2020 – Dec 2022</w:t>
+      </w:r>
+    </w:p>
+    <w:p>
+      <w:pPr>
+        <w:keepNext/>
+        <w:spacing w:before="20" w:after="80"/>
+      </w:pPr>
+      <w:r>
+        <w:rPr>
+          <w:rFonts w:ascii="Calibri" w:eastAsia="Calibri" w:hAnsi="Calibri" w:cs="Calibri"/>
+          <w:b/>
+          <w:bCs/>
+          <w:i/>
+          <w:iCs/>
+          <w:color w:val="2E5C8A"/>
+        </w:rPr>
+        <w:t>Software Engineer — Full Stack (B2B Web Applications)</w:t>
       </w:r>
     </w:p>
     <w:p>
@@ -1058,34 +1361,16 @@
           <w:ilvl w:val="0"/>
           <w:numId w:val="2"/>
         </w:numPr>
-        <w:spacing w:after="42" w:line="248" w:lineRule="auto"/>
-      </w:pPr>
-      <w:r>
-        <w:rPr>
-          <w:rFonts w:ascii="Calibri" w:eastAsia="Calibri" w:hAnsi="Calibri" w:cs="Calibri"/>
-          <w:color w:val="1A1A1A"/>
-          <w:sz w:val="19"/>
-          <w:szCs w:val="19"/>
-        </w:rPr>
-        <w:t xml:space="preserve">Analyzed </w:t>
-      </w:r>
-      <w:r>
-        <w:rPr>
-          <w:rFonts w:ascii="Calibri" w:eastAsia="Calibri" w:hAnsi="Calibri" w:cs="Calibri"/>
-          <w:color w:val="1A1A1A"/>
-          <w:sz w:val="19"/>
-          <w:szCs w:val="19"/>
-        </w:rPr>
-        <w:t xml:space="preserve">Human-AI </w:t>
-      </w:r>
-      <w:r>
-        <w:rPr>
-          <w:rFonts w:ascii="Calibri" w:eastAsia="Calibri" w:hAnsi="Calibri" w:cs="Calibri"/>
-          <w:color w:val="1A1A1A"/>
-          <w:sz w:val="19"/>
-          <w:szCs w:val="19"/>
-        </w:rPr>
-        <w:t>transcripts and model outputs to identify ambiguity, failed intents, context loss, unsupported responses, and other interaction-level failure modes, translating findings into model and prompt improvements.</w:t>
+        <w:spacing w:after="40" w:line="246" w:lineRule="auto"/>
+      </w:pPr>
+      <w:r>
+        <w:rPr>
+          <w:rFonts w:ascii="Calibri" w:eastAsia="Calibri" w:hAnsi="Calibri" w:cs="Calibri"/>
+          <w:color w:val="1A1A1A"/>
+          <w:sz w:val="19"/>
+          <w:szCs w:val="19"/>
+        </w:rPr>
+        <w:t>Developed responsive, client-facing B2B web applications using React, TypeScript, JavaScript, HTML5, and CSS3, built on reusable component-based UI patterns that kept interfaces consistent and accelerated feature delivery.</w:t>
       </w:r>
     </w:p>
     <w:p>
@@ -1095,120 +1380,16 @@
           <w:ilvl w:val="0"/>
           <w:numId w:val="2"/>
         </w:numPr>
-        <w:spacing w:after="42" w:line="248" w:lineRule="auto"/>
-      </w:pPr>
-      <w:r>
-        <w:rPr>
-          <w:rFonts w:ascii="Calibri" w:eastAsia="Calibri" w:hAnsi="Calibri" w:cs="Calibri"/>
-          <w:color w:val="1A1A1A"/>
-          <w:sz w:val="19"/>
-          <w:szCs w:val="19"/>
-        </w:rPr>
-        <w:t>Delivered two production conversational AI platforms end to end: an agentic legal assistant (LangChain, multi-step reasoning, NER-based masking of sensitive data, RAG over domain documents) and a citation-backed knowledge assistant (hybrid ChromaDB vector + keyword retrieval) — including Python/FastAPI services and React/TypeScript interfaces for both.</w:t>
-      </w:r>
-    </w:p>
-    <w:p>
-      <w:pPr>
-        <w:keepNext/>
-        <w:tabs>
-          <w:tab w:val="right" w:pos="10800"/>
-        </w:tabs>
-        <w:spacing w:before="190"/>
-      </w:pPr>
-      <w:r>
-        <w:rPr>
-          <w:rFonts w:ascii="Calibri" w:eastAsia="Calibri" w:hAnsi="Calibri" w:cs="Calibri"/>
-          <w:b/>
-          <w:bCs/>
-          <w:color w:val="1A1A1A"/>
-          <w:sz w:val="21"/>
-          <w:szCs w:val="21"/>
-        </w:rPr>
-        <w:t>Washington State University</w:t>
-      </w:r>
-      <w:r>
-        <w:rPr>
-          <w:rFonts w:ascii="Calibri" w:eastAsia="Calibri" w:hAnsi="Calibri" w:cs="Calibri"/>
-          <w:color w:val="595959"/>
-          <w:sz w:val="19"/>
-          <w:szCs w:val="19"/>
-        </w:rPr>
-        <w:t xml:space="preserve">  |  Pullman, WA</w:t>
-      </w:r>
-      <w:r>
-        <w:tab/>
-      </w:r>
-      <w:r>
-        <w:rPr>
-          <w:rFonts w:ascii="Calibri" w:eastAsia="Calibri" w:hAnsi="Calibri" w:cs="Calibri"/>
-          <w:b/>
-          <w:bCs/>
-          <w:color w:val="1F3864"/>
-          <w:sz w:val="19"/>
-          <w:szCs w:val="19"/>
-        </w:rPr>
-        <w:t>Jan 2023 – Dec 2024</w:t>
-      </w:r>
-    </w:p>
-    <w:p>
-      <w:pPr>
-        <w:keepNext/>
-        <w:spacing w:before="20" w:after="80"/>
-      </w:pPr>
-      <w:r>
-        <w:rPr>
-          <w:rFonts w:ascii="Calibri" w:eastAsia="Calibri" w:hAnsi="Calibri" w:cs="Calibri"/>
-          <w:b/>
-          <w:bCs/>
-          <w:i/>
-          <w:iCs/>
-          <w:color w:val="2E5C8A"/>
-        </w:rPr>
-        <w:t xml:space="preserve">Full Stack Engineer — </w:t>
-      </w:r>
-      <w:r>
-        <w:rPr>
-          <w:rFonts w:ascii="Calibri" w:eastAsia="Calibri" w:hAnsi="Calibri" w:cs="Calibri"/>
-          <w:b/>
-          <w:bCs/>
-          <w:i/>
-          <w:iCs/>
-          <w:color w:val="2E5C8A"/>
-        </w:rPr>
-        <w:t>AI</w:t>
-      </w:r>
-      <w:r>
-        <w:rPr>
-          <w:rFonts w:ascii="Calibri" w:eastAsia="Calibri" w:hAnsi="Calibri" w:cs="Calibri"/>
-          <w:b/>
-          <w:bCs/>
-          <w:i/>
-          <w:iCs/>
-          <w:color w:val="2E5C8A"/>
-        </w:rPr>
-        <w:t xml:space="preserve"> &amp;</w:t>
-      </w:r>
-      <w:r>
-        <w:rPr>
-          <w:rFonts w:ascii="Calibri" w:eastAsia="Calibri" w:hAnsi="Calibri" w:cs="Calibri"/>
-          <w:b/>
-          <w:bCs/>
-          <w:i/>
-          <w:iCs/>
-          <w:color w:val="2E5C8A"/>
-        </w:rPr>
-        <w:t xml:space="preserve"> </w:t>
-      </w:r>
-      <w:r>
-        <w:rPr>
-          <w:rFonts w:ascii="Calibri" w:eastAsia="Calibri" w:hAnsi="Calibri" w:cs="Calibri"/>
-          <w:b/>
-          <w:bCs/>
-          <w:i/>
-          <w:iCs/>
-          <w:color w:val="2E5C8A"/>
-        </w:rPr>
-        <w:t>Analytics Platform</w:t>
+        <w:spacing w:after="40" w:line="246" w:lineRule="auto"/>
+      </w:pPr>
+      <w:r>
+        <w:rPr>
+          <w:rFonts w:ascii="Calibri" w:eastAsia="Calibri" w:hAnsi="Calibri" w:cs="Calibri"/>
+          <w:color w:val="1A1A1A"/>
+          <w:sz w:val="19"/>
+          <w:szCs w:val="19"/>
+        </w:rPr>
+        <w:t>Translated business requirements and Figma wireframes into responsive interfaces and dashboards, integrated with RESTful APIs and backend microservices through dynamic data rendering, asynchronous workflows, and API-driven application state.</w:t>
       </w:r>
     </w:p>
     <w:p>
@@ -1218,25 +1399,112 @@
           <w:ilvl w:val="0"/>
           <w:numId w:val="2"/>
         </w:numPr>
-        <w:spacing w:after="42" w:line="248" w:lineRule="auto"/>
-      </w:pPr>
-      <w:r>
-        <w:rPr>
-          <w:rFonts w:ascii="Calibri" w:eastAsia="Calibri" w:hAnsi="Calibri" w:cs="Calibri"/>
-          <w:color w:val="1A1A1A"/>
-          <w:sz w:val="19"/>
-          <w:szCs w:val="19"/>
-        </w:rPr>
-        <w:t>Built client-facing web applications for an AI and analytics platform using React, JavaScript, HTML5, and CSS3, delivering responsive interfaces for analytics workflows and AI-generated insights</w:t>
-      </w:r>
-      <w:r>
-        <w:rPr>
-          <w:rFonts w:ascii="Calibri" w:eastAsia="Calibri" w:hAnsi="Calibri" w:cs="Calibri"/>
-          <w:color w:val="1A1A1A"/>
-          <w:sz w:val="19"/>
-          <w:szCs w:val="19"/>
-        </w:rPr>
-        <w:t>.</w:t>
+        <w:spacing w:after="40" w:line="246" w:lineRule="auto"/>
+      </w:pPr>
+      <w:r>
+        <w:rPr>
+          <w:rFonts w:ascii="Calibri" w:eastAsia="Calibri" w:hAnsi="Calibri" w:cs="Calibri"/>
+          <w:color w:val="1A1A1A"/>
+          <w:sz w:val="19"/>
+          <w:szCs w:val="19"/>
+        </w:rPr>
+        <w:t>Improved frontend performance through lazy loading, efficient state management, code splitting, and client-side caching, contributing to a 10% improvement in application responsiveness, and maintained Cypress test coverage over critical user workflows.</w:t>
+      </w:r>
+    </w:p>
+    <w:p>
+      <w:pPr>
+        <w:keepNext/>
+        <w:pBdr>
+          <w:bottom w:val="single" w:sz="8" w:space="3" w:color="1F3864"/>
+        </w:pBdr>
+        <w:spacing w:before="150" w:after="70"/>
+      </w:pPr>
+      <w:r>
+        <w:rPr>
+          <w:rFonts w:ascii="Georgia" w:eastAsia="Georgia" w:hAnsi="Georgia" w:cs="Georgia"/>
+          <w:b/>
+          <w:bCs/>
+          <w:color w:val="1F3864"/>
+          <w:spacing w:val="30"/>
+          <w:sz w:val="21"/>
+          <w:szCs w:val="21"/>
+        </w:rPr>
+        <w:t>SELECTED PROJECTS</w:t>
+      </w:r>
+    </w:p>
+    <w:p>
+      <w:pPr>
+        <w:keepNext/>
+        <w:spacing w:before="95" w:after="15"/>
+        <w:rPr>
+          <w:rFonts w:ascii="Calibri" w:eastAsia="Calibri" w:hAnsi="Calibri" w:cs="Calibri"/>
+          <w:b/>
+          <w:bCs/>
+          <w:color w:val="1F3864"/>
+          <w:sz w:val="19"/>
+          <w:szCs w:val="19"/>
+        </w:rPr>
+      </w:pPr>
+      <w:r>
+        <w:rPr>
+          <w:rFonts w:ascii="Calibri" w:eastAsia="Calibri" w:hAnsi="Calibri" w:cs="Calibri"/>
+          <w:b/>
+          <w:bCs/>
+          <w:color w:val="1F3864"/>
+          <w:sz w:val="19"/>
+          <w:szCs w:val="19"/>
+        </w:rPr>
+        <w:t>Paralegal Agentic AI Platform  |  Conversational Legal Assistant</w:t>
+      </w:r>
+      <w:r>
+        <w:t xml:space="preserve"> </w:t>
+      </w:r>
+      <w:r>
+        <w:tab/>
+      </w:r>
+      <w:r>
+        <w:tab/>
+      </w:r>
+      <w:r>
+        <w:tab/>
+      </w:r>
+      <w:r>
+        <w:tab/>
+      </w:r>
+      <w:r>
+        <w:tab/>
+      </w:r>
+      <w:r>
+        <w:tab/>
+      </w:r>
+      <w:r>
+        <w:tab/>
+      </w:r>
+      <w:r>
+        <w:tab/>
+        <w:t xml:space="preserve">      </w:t>
+      </w:r>
+      <w:r>
+        <w:rPr>
+          <w:rFonts w:ascii="Calibri" w:eastAsia="Calibri" w:hAnsi="Calibri" w:cs="Calibri"/>
+          <w:b/>
+          <w:bCs/>
+          <w:color w:val="1F3864"/>
+          <w:sz w:val="19"/>
+          <w:szCs w:val="19"/>
+        </w:rPr>
+        <w:t>202</w:t>
+      </w:r>
+      <w:r>
+        <w:rPr>
+          <w:rFonts w:ascii="Calibri" w:eastAsia="Calibri" w:hAnsi="Calibri" w:cs="Calibri"/>
+          <w:b/>
+          <w:bCs/>
+          <w:color w:val="1F3864"/>
+          <w:sz w:val="19"/>
+          <w:szCs w:val="19"/>
+        </w:rPr>
+        <w:t>6</w:t>
       </w:r>
     </w:p>
     <w:p>
@@ -1246,16 +1514,34 @@
           <w:ilvl w:val="0"/>
           <w:numId w:val="2"/>
         </w:numPr>
-        <w:spacing w:after="42" w:line="248" w:lineRule="auto"/>
-      </w:pPr>
-      <w:r>
-        <w:rPr>
-          <w:rFonts w:ascii="Calibri" w:eastAsia="Calibri" w:hAnsi="Calibri" w:cs="Calibri"/>
-          <w:color w:val="1A1A1A"/>
-          <w:sz w:val="19"/>
-          <w:szCs w:val="19"/>
-        </w:rPr>
-        <w:t>Developed interactive data views for users to explore analytics results and AI-generated outputs.</w:t>
+        <w:spacing w:after="45" w:line="248" w:lineRule="auto"/>
+      </w:pPr>
+      <w:r>
+        <w:rPr>
+          <w:rFonts w:ascii="Calibri" w:eastAsia="Calibri" w:hAnsi="Calibri" w:cs="Calibri"/>
+          <w:color w:val="1A1A1A"/>
+          <w:sz w:val="19"/>
+          <w:szCs w:val="19"/>
+        </w:rPr>
+        <w:t xml:space="preserve">Designed and developed an AI-powered </w:t>
+      </w:r>
+      <w:r>
+        <w:rPr>
+          <w:rFonts w:ascii="Calibri" w:eastAsia="Calibri" w:hAnsi="Calibri" w:cs="Calibri"/>
+          <w:color w:val="1A1A1A"/>
+          <w:sz w:val="19"/>
+          <w:szCs w:val="19"/>
+        </w:rPr>
+        <w:t>legal conversational</w:t>
+      </w:r>
+      <w:r>
+        <w:rPr>
+          <w:rFonts w:ascii="Calibri" w:eastAsia="Calibri" w:hAnsi="Calibri" w:cs="Calibri"/>
+          <w:color w:val="1A1A1A"/>
+          <w:sz w:val="19"/>
+          <w:szCs w:val="19"/>
+        </w:rPr>
+        <w:t xml:space="preserve"> assistant using LangChain and LLM-based multi-step reasoning to support contextual, interactive user conversations and document analysis across complex legal workflows.</w:t>
       </w:r>
     </w:p>
     <w:p>
@@ -1265,16 +1551,16 @@
           <w:ilvl w:val="0"/>
           <w:numId w:val="2"/>
         </w:numPr>
-        <w:spacing w:after="42" w:line="248" w:lineRule="auto"/>
-      </w:pPr>
-      <w:r>
-        <w:rPr>
-          <w:rFonts w:ascii="Calibri" w:eastAsia="Calibri" w:hAnsi="Calibri" w:cs="Calibri"/>
-          <w:color w:val="1A1A1A"/>
-          <w:sz w:val="19"/>
-          <w:szCs w:val="19"/>
-        </w:rPr>
-        <w:t>Integrated the frontend with FastAPI and REST APIs through asynchronous data retrieval, dynamic content rendering, and structured JSON-based client–server communication.</w:t>
+        <w:spacing w:after="45" w:line="248" w:lineRule="auto"/>
+      </w:pPr>
+      <w:r>
+        <w:rPr>
+          <w:rFonts w:ascii="Calibri" w:eastAsia="Calibri" w:hAnsi="Calibri" w:cs="Calibri"/>
+          <w:color w:val="1A1A1A"/>
+          <w:sz w:val="19"/>
+          <w:szCs w:val="19"/>
+        </w:rPr>
+        <w:t>Integrated Gemini and Grok with NLP-based Named Entity Recognition (NER) pipelines to extract, classify, and securely mask sensitive legal entities before AI processing.</w:t>
       </w:r>
     </w:p>
     <w:p>
@@ -1284,49 +1570,23 @@
           <w:ilvl w:val="0"/>
           <w:numId w:val="2"/>
         </w:numPr>
-        <w:spacing w:after="42" w:line="248" w:lineRule="auto"/>
-      </w:pPr>
-      <w:r>
-        <w:rPr>
-          <w:rFonts w:ascii="Calibri" w:eastAsia="Calibri" w:hAnsi="Calibri" w:cs="Calibri"/>
-          <w:color w:val="1A1A1A"/>
-          <w:sz w:val="19"/>
-          <w:szCs w:val="19"/>
-        </w:rPr>
-        <w:t>Developed Python microservices and NLP preprocessing pipelines supporting scalable analytics and AI-driven data processing, with structured logging, monitoring, and fault-tolerant processing.</w:t>
+        <w:spacing w:after="45" w:line="248" w:lineRule="auto"/>
+      </w:pPr>
+      <w:r>
+        <w:rPr>
+          <w:rFonts w:ascii="Calibri" w:eastAsia="Calibri" w:hAnsi="Calibri" w:cs="Calibri"/>
+          <w:color w:val="1A1A1A"/>
+          <w:sz w:val="19"/>
+          <w:szCs w:val="19"/>
+        </w:rPr>
+        <w:t>Built RAG pipelines using vector embeddings and semantic search for grounded responses from domain-specific legal documents, backed by Python/FastAPI services (document ingestion, chunking, retrieval, AI inference) and React/TypeScript interfaces.</w:t>
       </w:r>
     </w:p>
     <w:p>
       <w:pPr>
         <w:keepNext/>
-        <w:tabs>
-          <w:tab w:val="right" w:pos="10800"/>
-        </w:tabs>
-        <w:spacing w:before="190"/>
-      </w:pPr>
-      <w:r>
-        <w:rPr>
-          <w:rFonts w:ascii="Calibri" w:eastAsia="Calibri" w:hAnsi="Calibri" w:cs="Calibri"/>
-          <w:b/>
-          <w:bCs/>
-          <w:color w:val="1A1A1A"/>
-          <w:sz w:val="21"/>
-          <w:szCs w:val="21"/>
-        </w:rPr>
-        <w:t>Deloitte</w:t>
-      </w:r>
-      <w:r>
-        <w:rPr>
-          <w:rFonts w:ascii="Calibri" w:eastAsia="Calibri" w:hAnsi="Calibri" w:cs="Calibri"/>
-          <w:color w:val="595959"/>
-          <w:sz w:val="19"/>
-          <w:szCs w:val="19"/>
-        </w:rPr>
-        <w:t xml:space="preserve">  |  India</w:t>
-      </w:r>
-      <w:r>
-        <w:tab/>
-      </w:r>
+        <w:spacing w:before="95" w:after="15"/>
+      </w:pPr>
       <w:r>
         <w:rPr>
           <w:rFonts w:ascii="Calibri" w:eastAsia="Calibri" w:hAnsi="Calibri" w:cs="Calibri"/>
@@ -1336,24 +1596,87 @@
           <w:sz w:val="19"/>
           <w:szCs w:val="19"/>
         </w:rPr>
-        <w:t>Mar 2021 – Dec 2022</w:t>
-      </w:r>
-    </w:p>
-    <w:p>
-      <w:pPr>
-        <w:keepNext/>
-        <w:spacing w:before="20" w:after="80"/>
-      </w:pPr>
+        <w:t>Scholar Assistant  |  Conversational RAG AI</w:t>
+      </w:r>
+      <w:r>
+        <w:tab/>
+      </w:r>
+      <w:r>
+        <w:tab/>
+      </w:r>
+      <w:r>
+        <w:tab/>
+      </w:r>
+      <w:r>
+        <w:tab/>
+      </w:r>
+      <w:r>
+        <w:tab/>
+      </w:r>
+      <w:r>
+        <w:tab/>
+      </w:r>
+      <w:r>
+        <w:tab/>
+      </w:r>
+      <w:r>
+        <w:tab/>
+      </w:r>
       <w:r>
         <w:rPr>
           <w:rFonts w:ascii="Calibri" w:eastAsia="Calibri" w:hAnsi="Calibri" w:cs="Calibri"/>
           <w:b/>
           <w:bCs/>
-          <w:i/>
-          <w:iCs/>
-          <w:color w:val="2E5C8A"/>
-        </w:rPr>
-        <w:t>Frontend Developer — B2B Web Applications</w:t>
+          <w:color w:val="1F3864"/>
+          <w:sz w:val="19"/>
+          <w:szCs w:val="19"/>
+        </w:rPr>
+        <w:t xml:space="preserve">       </w:t>
+      </w:r>
+      <w:r>
+        <w:rPr>
+          <w:rFonts w:ascii="Calibri" w:eastAsia="Calibri" w:hAnsi="Calibri" w:cs="Calibri"/>
+          <w:b/>
+          <w:bCs/>
+          <w:color w:val="1F3864"/>
+          <w:sz w:val="19"/>
+          <w:szCs w:val="19"/>
+        </w:rPr>
+        <w:tab/>
+      </w:r>
+      <w:r>
+        <w:rPr>
+          <w:rFonts w:ascii="Calibri" w:eastAsia="Calibri" w:hAnsi="Calibri" w:cs="Calibri"/>
+          <w:b/>
+          <w:bCs/>
+          <w:color w:val="1F3864"/>
+          <w:sz w:val="19"/>
+          <w:szCs w:val="19"/>
+        </w:rPr>
+        <w:tab/>
+        <w:t xml:space="preserve">       </w:t>
+      </w:r>
+      <w:r>
+        <w:rPr>
+          <w:rFonts w:ascii="Calibri" w:eastAsia="Calibri" w:hAnsi="Calibri" w:cs="Calibri"/>
+          <w:b/>
+          <w:bCs/>
+          <w:color w:val="1F3864"/>
+          <w:sz w:val="19"/>
+          <w:szCs w:val="19"/>
+        </w:rPr>
+        <w:t>202</w:t>
+      </w:r>
+      <w:r>
+        <w:rPr>
+          <w:rFonts w:ascii="Calibri" w:eastAsia="Calibri" w:hAnsi="Calibri" w:cs="Calibri"/>
+          <w:b/>
+          <w:bCs/>
+          <w:color w:val="1F3864"/>
+          <w:sz w:val="19"/>
+          <w:szCs w:val="19"/>
+        </w:rPr>
+        <w:t>5</w:t>
       </w:r>
     </w:p>
     <w:p>
@@ -1363,305 +1686,34 @@
           <w:ilvl w:val="0"/>
           <w:numId w:val="2"/>
         </w:numPr>
-        <w:spacing w:after="42" w:line="248" w:lineRule="auto"/>
-      </w:pPr>
-      <w:r>
-        <w:rPr>
-          <w:rFonts w:ascii="Calibri" w:eastAsia="Calibri" w:hAnsi="Calibri" w:cs="Calibri"/>
-          <w:color w:val="1A1A1A"/>
-          <w:sz w:val="19"/>
-          <w:szCs w:val="19"/>
-        </w:rPr>
-        <w:t>Developed responsive, client-facing B2B web applications in React, TypeScript, HTML5, and CSS3, delivering interactive workflows and reusable component patterns across multiple modules.</w:t>
-      </w:r>
-    </w:p>
-    <w:p>
-      <w:pPr>
-        <w:pStyle w:val="ListParagraph"/>
-        <w:numPr>
-          <w:ilvl w:val="0"/>
-          <w:numId w:val="2"/>
-        </w:numPr>
-        <w:spacing w:after="42" w:line="248" w:lineRule="auto"/>
-      </w:pPr>
-      <w:r>
-        <w:rPr>
-          <w:rFonts w:ascii="Calibri" w:eastAsia="Calibri" w:hAnsi="Calibri" w:cs="Calibri"/>
-          <w:color w:val="1A1A1A"/>
-          <w:sz w:val="19"/>
-          <w:szCs w:val="19"/>
-        </w:rPr>
-        <w:t>Translated business requirements and Figma wireframes into responsive, production-ready interfaces, collaborating with UI/UX designers on layout, interaction behavior, and usability.</w:t>
-      </w:r>
-    </w:p>
-    <w:p>
-      <w:pPr>
-        <w:pStyle w:val="ListParagraph"/>
-        <w:numPr>
-          <w:ilvl w:val="0"/>
-          <w:numId w:val="2"/>
-        </w:numPr>
-        <w:spacing w:after="42" w:line="248" w:lineRule="auto"/>
-      </w:pPr>
-      <w:r>
-        <w:rPr>
-          <w:rFonts w:ascii="Calibri" w:eastAsia="Calibri" w:hAnsi="Calibri" w:cs="Calibri"/>
-          <w:color w:val="1A1A1A"/>
-          <w:sz w:val="19"/>
-          <w:szCs w:val="19"/>
-        </w:rPr>
-        <w:t xml:space="preserve">Built interactive dashboards </w:t>
-      </w:r>
-      <w:r>
-        <w:rPr>
-          <w:rFonts w:ascii="Calibri" w:eastAsia="Calibri" w:hAnsi="Calibri" w:cs="Calibri"/>
-          <w:color w:val="1A1A1A"/>
-          <w:sz w:val="19"/>
-          <w:szCs w:val="19"/>
-        </w:rPr>
-        <w:t>and</w:t>
-      </w:r>
-      <w:r>
-        <w:rPr>
-          <w:rFonts w:ascii="Calibri" w:eastAsia="Calibri" w:hAnsi="Calibri" w:cs="Calibri"/>
-          <w:color w:val="1A1A1A"/>
-          <w:sz w:val="19"/>
-          <w:szCs w:val="19"/>
-        </w:rPr>
-        <w:t xml:space="preserve"> workflow interfaces using reusable React components, state management, and REST API integrations.</w:t>
-      </w:r>
-    </w:p>
-    <w:p>
-      <w:pPr>
-        <w:pStyle w:val="ListParagraph"/>
-        <w:numPr>
-          <w:ilvl w:val="0"/>
-          <w:numId w:val="2"/>
-        </w:numPr>
-        <w:spacing w:after="42" w:line="248" w:lineRule="auto"/>
-      </w:pPr>
-      <w:r>
-        <w:rPr>
-          <w:rFonts w:ascii="Calibri" w:eastAsia="Calibri" w:hAnsi="Calibri" w:cs="Calibri"/>
-          <w:color w:val="1A1A1A"/>
-          <w:sz w:val="19"/>
-          <w:szCs w:val="19"/>
-        </w:rPr>
-        <w:t xml:space="preserve">Implemented asynchronous </w:t>
-      </w:r>
-      <w:r>
-        <w:rPr>
-          <w:rFonts w:ascii="Calibri" w:eastAsia="Calibri" w:hAnsi="Calibri" w:cs="Calibri"/>
-          <w:color w:val="1A1A1A"/>
-          <w:sz w:val="19"/>
-          <w:szCs w:val="19"/>
-        </w:rPr>
-        <w:t>programming</w:t>
-      </w:r>
-      <w:r>
-        <w:rPr>
-          <w:rFonts w:ascii="Calibri" w:eastAsia="Calibri" w:hAnsi="Calibri" w:cs="Calibri"/>
-          <w:color w:val="1A1A1A"/>
-          <w:sz w:val="19"/>
-          <w:szCs w:val="19"/>
-        </w:rPr>
-        <w:t>, dynamic data rendering, and form-driven workflows across complex business applications.</w:t>
-      </w:r>
-    </w:p>
-    <w:p>
-      <w:pPr>
-        <w:pStyle w:val="ListParagraph"/>
-        <w:numPr>
-          <w:ilvl w:val="0"/>
-          <w:numId w:val="2"/>
-        </w:numPr>
-        <w:spacing w:after="42" w:line="248" w:lineRule="auto"/>
-      </w:pPr>
-      <w:r>
-        <w:rPr>
-          <w:rFonts w:ascii="Calibri" w:eastAsia="Calibri" w:hAnsi="Calibri" w:cs="Calibri"/>
-          <w:color w:val="1A1A1A"/>
-          <w:sz w:val="19"/>
-          <w:szCs w:val="19"/>
-        </w:rPr>
-        <w:t>Improved application responsiveness by 10% through lazy loading, code splitting, efficient state management, and caching; maintained Cypress test coverage across critical user workflows.</w:t>
-      </w:r>
-    </w:p>
-    <w:p>
-      <w:pPr>
-        <w:keepNext/>
-        <w:tabs>
-          <w:tab w:val="right" w:pos="10800"/>
-        </w:tabs>
-        <w:spacing w:before="190"/>
-      </w:pPr>
-      <w:r>
-        <w:rPr>
-          <w:rFonts w:ascii="Calibri" w:eastAsia="Calibri" w:hAnsi="Calibri" w:cs="Calibri"/>
-          <w:b/>
-          <w:bCs/>
-          <w:color w:val="1A1A1A"/>
-          <w:sz w:val="21"/>
-          <w:szCs w:val="21"/>
-        </w:rPr>
-        <w:t>Cogent Technocom Service &amp; Solutions LLP</w:t>
-      </w:r>
-      <w:r>
-        <w:rPr>
-          <w:rFonts w:ascii="Calibri" w:eastAsia="Calibri" w:hAnsi="Calibri" w:cs="Calibri"/>
-          <w:color w:val="595959"/>
-          <w:sz w:val="19"/>
-          <w:szCs w:val="19"/>
-        </w:rPr>
-        <w:t xml:space="preserve">  |  India</w:t>
-      </w:r>
-      <w:r>
-        <w:tab/>
-      </w:r>
-      <w:r>
-        <w:rPr>
-          <w:rFonts w:ascii="Calibri" w:eastAsia="Calibri" w:hAnsi="Calibri" w:cs="Calibri"/>
-          <w:b/>
-          <w:bCs/>
-          <w:color w:val="1F3864"/>
-          <w:sz w:val="19"/>
-          <w:szCs w:val="19"/>
-        </w:rPr>
-        <w:t>Dec 2020 – Mar 2021</w:t>
-      </w:r>
-    </w:p>
-    <w:p>
-      <w:pPr>
-        <w:keepNext/>
-        <w:spacing w:before="20" w:after="80"/>
-      </w:pPr>
-      <w:r>
-        <w:rPr>
-          <w:rFonts w:ascii="Calibri" w:eastAsia="Calibri" w:hAnsi="Calibri" w:cs="Calibri"/>
-          <w:b/>
-          <w:bCs/>
-          <w:i/>
-          <w:iCs/>
-          <w:color w:val="2E5C8A"/>
-        </w:rPr>
-        <w:t>Full Stack Engineer</w:t>
-      </w:r>
-    </w:p>
-    <w:p>
-      <w:pPr>
-        <w:pStyle w:val="ListParagraph"/>
-        <w:numPr>
-          <w:ilvl w:val="0"/>
-          <w:numId w:val="2"/>
-        </w:numPr>
-        <w:spacing w:after="42" w:line="248" w:lineRule="auto"/>
-      </w:pPr>
-      <w:r>
-        <w:rPr>
-          <w:rFonts w:ascii="Calibri" w:eastAsia="Calibri" w:hAnsi="Calibri" w:cs="Calibri"/>
-          <w:color w:val="1A1A1A"/>
-          <w:sz w:val="19"/>
-          <w:szCs w:val="19"/>
-        </w:rPr>
-        <w:t>Engineered a full-stack real-time quiz application on Microsoft Kaizala using React, TypeScript, and RESTful microservices, with WebSocket data pipelines delivering instant UI updates.</w:t>
-      </w:r>
-    </w:p>
-    <w:p>
-      <w:pPr>
-        <w:pStyle w:val="ListParagraph"/>
-        <w:numPr>
-          <w:ilvl w:val="0"/>
-          <w:numId w:val="2"/>
-        </w:numPr>
-        <w:spacing w:after="42" w:line="248" w:lineRule="auto"/>
-      </w:pPr>
-      <w:r>
-        <w:rPr>
-          <w:rFonts w:ascii="Calibri" w:eastAsia="Calibri" w:hAnsi="Calibri" w:cs="Calibri"/>
-          <w:color w:val="1A1A1A"/>
-          <w:sz w:val="19"/>
-          <w:szCs w:val="19"/>
-        </w:rPr>
-        <w:t>Reduced frontend load times by 35% via code-splitting, lazy loading, and memoization, and architected reusable Redux/Context state management patterns that accelerated UI delivery.</w:t>
-      </w:r>
-    </w:p>
-    <w:p>
-      <w:pPr>
-        <w:keepNext/>
-        <w:tabs>
-          <w:tab w:val="right" w:pos="10800"/>
-        </w:tabs>
-        <w:spacing w:before="190"/>
-      </w:pPr>
-      <w:r>
-        <w:rPr>
-          <w:rFonts w:ascii="Calibri" w:eastAsia="Calibri" w:hAnsi="Calibri" w:cs="Calibri"/>
-          <w:b/>
-          <w:bCs/>
-          <w:color w:val="1A1A1A"/>
-          <w:sz w:val="21"/>
-          <w:szCs w:val="21"/>
-        </w:rPr>
-        <w:t>SmartKnower</w:t>
-      </w:r>
-      <w:r>
-        <w:rPr>
-          <w:rFonts w:ascii="Calibri" w:eastAsia="Calibri" w:hAnsi="Calibri" w:cs="Calibri"/>
-          <w:color w:val="595959"/>
-          <w:sz w:val="19"/>
-          <w:szCs w:val="19"/>
-        </w:rPr>
-        <w:t xml:space="preserve">  |  India</w:t>
-      </w:r>
-      <w:r>
-        <w:tab/>
-      </w:r>
-      <w:r>
-        <w:rPr>
-          <w:rFonts w:ascii="Calibri" w:eastAsia="Calibri" w:hAnsi="Calibri" w:cs="Calibri"/>
-          <w:b/>
-          <w:bCs/>
-          <w:color w:val="1F3864"/>
-          <w:sz w:val="19"/>
-          <w:szCs w:val="19"/>
-        </w:rPr>
-        <w:t>Sep 2020 – Nov 2020</w:t>
-      </w:r>
-    </w:p>
-    <w:p>
-      <w:pPr>
-        <w:keepNext/>
-        <w:spacing w:before="20" w:after="80"/>
-      </w:pPr>
-      <w:r>
-        <w:rPr>
-          <w:rFonts w:ascii="Calibri" w:eastAsia="Calibri" w:hAnsi="Calibri" w:cs="Calibri"/>
-          <w:b/>
-          <w:bCs/>
-          <w:i/>
-          <w:iCs/>
-          <w:color w:val="2E5C8A"/>
-        </w:rPr>
-        <w:t>Machine Learning Intern</w:t>
-      </w:r>
-    </w:p>
-    <w:p>
-      <w:pPr>
-        <w:pStyle w:val="ListParagraph"/>
-        <w:numPr>
-          <w:ilvl w:val="0"/>
-          <w:numId w:val="2"/>
-        </w:numPr>
-        <w:spacing w:after="42" w:line="248" w:lineRule="auto"/>
-      </w:pPr>
-      <w:r>
-        <w:rPr>
-          <w:rFonts w:ascii="Calibri" w:eastAsia="Calibri" w:hAnsi="Calibri" w:cs="Calibri"/>
-          <w:color w:val="1A1A1A"/>
-          <w:sz w:val="19"/>
-          <w:szCs w:val="19"/>
-        </w:rPr>
-        <w:t>Built and deployed image classification and sentiment analysis models (Python, Scikit-learn, SVM, Decision Trees) with end-to-end NLP preprocessing pipelines, served via Flask/FastAPI REST APIs and visualized through interactive React dashboards.</w:t>
+        <w:spacing w:after="45" w:line="248" w:lineRule="auto"/>
+      </w:pPr>
+      <w:r>
+        <w:rPr>
+          <w:rFonts w:ascii="Calibri" w:eastAsia="Calibri" w:hAnsi="Calibri" w:cs="Calibri"/>
+          <w:color w:val="1A1A1A"/>
+          <w:sz w:val="19"/>
+          <w:szCs w:val="19"/>
+        </w:rPr>
+        <w:t>Built a multi-turn conversational AI assistant using RAG, powered by Gemini 2.5 Flash, with hybrid retrieval (semantic + keyword via ChromaDB) and iterative prompt evaluation to improve response grounding and conversational consistency</w:t>
+      </w:r>
+      <w:r>
+        <w:rPr>
+          <w:rFonts w:ascii="Calibri" w:eastAsia="Calibri" w:hAnsi="Calibri" w:cs="Calibri"/>
+          <w:color w:val="1A1A1A"/>
+          <w:sz w:val="19"/>
+          <w:szCs w:val="19"/>
+        </w:rPr>
+        <w:t xml:space="preserve"> on religious scriptures</w:t>
+      </w:r>
+      <w:r>
+        <w:rPr>
+          <w:rFonts w:ascii="Calibri" w:eastAsia="Calibri" w:hAnsi="Calibri" w:cs="Calibri"/>
+          <w:color w:val="1A1A1A"/>
+          <w:sz w:val="19"/>
+          <w:szCs w:val="19"/>
+        </w:rPr>
+        <w:t>.</w:t>
       </w:r>
     </w:p>
     <w:p>
@@ -1670,7 +1722,7 @@
         <w:pBdr>
           <w:bottom w:val="single" w:sz="8" w:space="3" w:color="1F3864"/>
         </w:pBdr>
-        <w:spacing w:before="200" w:after="80"/>
+        <w:spacing w:before="150" w:after="70"/>
       </w:pPr>
       <w:r>
         <w:rPr>
@@ -1699,6 +1751,9 @@
         <w:gridCol w:w="5520"/>
       </w:tblGrid>
       <w:tr>
+        <w:trPr>
+          <w:cantSplit/>
+        </w:trPr>
         <w:tc>
           <w:tcPr>
             <w:tcW w:w="5280" w:type="dxa"/>
@@ -1739,7 +1794,7 @@
                 <w:sz w:val="19"/>
                 <w:szCs w:val="19"/>
               </w:rPr>
-              <w:t>M.S., Computer Science (Artificial Intelligence &amp; Machine Learning)</w:t>
+              <w:t>M.S., Computer Science — AI &amp; Machine Learning</w:t>
             </w:r>
           </w:p>
           <w:p>
@@ -1783,7 +1838,25 @@
                 <w:sz w:val="18"/>
                 <w:szCs w:val="18"/>
               </w:rPr>
-              <w:t>Manipal Institute of Technology, India</w:t>
+              <w:t>Manipal Institute of Technology</w:t>
+            </w:r>
+            <w:r>
+              <w:rPr>
+                <w:rFonts w:ascii="Calibri" w:eastAsia="Calibri" w:hAnsi="Calibri" w:cs="Calibri"/>
+                <w:color w:val="595959"/>
+                <w:sz w:val="18"/>
+                <w:szCs w:val="18"/>
+              </w:rPr>
+              <w:t xml:space="preserve"> (MIT)</w:t>
+            </w:r>
+            <w:r>
+              <w:rPr>
+                <w:rFonts w:ascii="Calibri" w:eastAsia="Calibri" w:hAnsi="Calibri" w:cs="Calibri"/>
+                <w:color w:val="595959"/>
+                <w:sz w:val="18"/>
+                <w:szCs w:val="18"/>
+              </w:rPr>
+              <w:t>, India</w:t>
             </w:r>
           </w:p>
         </w:tc>
@@ -1849,7 +1922,7 @@
                 <w:sz w:val="19"/>
                 <w:szCs w:val="19"/>
               </w:rPr>
-              <w:t>LLMs &amp; Agentic AI — LinkedIn Learning</w:t>
+              <w:t>Building RAG Agents with LLMs — NVIDIA</w:t>
             </w:r>
           </w:p>
           <w:p>
@@ -1868,7 +1941,7 @@
                 <w:sz w:val="19"/>
                 <w:szCs w:val="19"/>
               </w:rPr>
-              <w:t>Building RAG Agents with LLMs — NVIDIA</w:t>
+              <w:t>LLMs &amp; Agentic AI — LinkedIn Learning</w:t>
             </w:r>
           </w:p>
           <w:p>
@@ -1895,7 +1968,7 @@
     </w:tbl>
     <w:p/>
     <w:sectPr>
-      <w:footerReference w:type="default" r:id="rId7"/>
+      <w:footerReference w:type="default" r:id="rId8"/>
       <w:pgSz w:w="12240" w:h="15840"/>
       <w:pgMar w:top="720" w:right="720" w:bottom="620" w:left="720" w:header="708" w:footer="708" w:gutter="0"/>
       <w:cols w:space="720"/>
@@ -1943,7 +2016,7 @@
         <w:sz w:val="16"/>
         <w:szCs w:val="16"/>
       </w:rPr>
-      <w:t>Arnav Jain  |  Senior AI Engineer &amp; Frontend Developer</w:t>
+      <w:t>Arnav Jain  |  Senior AI Full Stack Engineer</w:t>
     </w:r>
     <w:r>
       <w:tab/>
@@ -2084,10 +2157,10 @@
 <file path=word/numbering.xml><?xml version="1.0" encoding="utf-8"?>
 <w:numbering xmlns:wpc="http://schemas.microsoft.com/office/word/2010/wordprocessingCanvas" xmlns:cx="http://schemas.microsoft.com/office/drawing/2014/chartex" xmlns:cx1="http://schemas.microsoft.com/office/drawing/2015/9/8/chartex" xmlns:cx2="http://schemas.microsoft.com/office/drawing/2015/10/21/chartex" xmlns:cx3="http://schemas.microsoft.com/office/drawing/2016/5/9/chartex" xmlns:cx4="http://schemas.microsoft.com/office/drawing/2016/5/10/chartex" xmlns:cx5="http://schemas.microsoft.com/office/drawing/2016/5/11/chartex" xmlns:cx6="http://schemas.microsoft.com/office/drawing/2016/5/12/chartex" xmlns:cx7="http://schemas.microsoft.com/office/drawing/2016/5/13/chartex" xmlns:cx8="http://schemas.microsoft.com/office/drawing/2016/5/14/chartex" xmlns:mc="http://schemas.openxmlformats.org/markup-compatibility/2006" xmlns:aink="http://schemas.microsoft.com/office/drawing/2016/ink" xmlns:am3d="http://schemas.microsoft.com/office/drawing/2017/model3d" xmlns:o="urn:schemas-microsoft-com:office:office" xmlns:oel="http://schemas.microsoft.com/office/2019/extlst" xmlns:r="http://schemas.openxmlformats.org/officeDocument/2006/relationships" xmlns:m="http://schemas.openxmlformats.org/officeDocument/2006/math" xmlns:v="urn:schemas-microsoft-com:vml" xmlns:wp14="http://schemas.microsoft.com/office/word/2010/wordprocessingDrawing" xmlns:wp="http://schemas.openxmlformats.org/drawingml/2006/wordprocessingDrawing" xmlns:w10="urn:schemas-microsoft-com:office:word" xmlns:w="http://schemas.openxmlformats.org/wordprocessingml/2006/main" xmlns:w14="http://schemas.microsoft.com/office/word/2010/wordml" xmlns:w15="http://schemas.microsoft.com/office/word/2012/wordml" xmlns:w16cei="http://schemas.microsoft.com/office/word/2026/wordml/cei" xmlns:w16cex="http://schemas.microsoft.com/office/word/2018/wordml/cex" xmlns:w16cid="http://schemas.microsoft.com/office/word/2016/wordml/cid" xmlns:w16="http://schemas.microsoft.com/office/word/2018/wordml" xmlns:w16du="http://schemas.microsoft.com/office/word/2023/wordml/word16du" xmlns:w16sdtdh="http://schemas.microsoft.com/office/word/2020/wordml/sdtdatahash" xmlns:w16sdtfl="http://schemas.microsoft.com/office/word/2024/wordml/sdtformatlock" xmlns:w16se="http://schemas.microsoft.com/office/word/2015/wordml/symex" xmlns:wpg="http://schemas.microsoft.com/office/word/2010/wordprocessingGroup" xmlns:wpi="http://schemas.microsoft.com/office/word/2010/wordprocessingInk" xmlns:wne="http://schemas.microsoft.com/office/word/2006/wordml" xmlns:wps="http://schemas.microsoft.com/office/word/2010/wordprocessingShape" mc:Ignorable="w14 w15 w16se w16cid w16 w16cex w16sdtdh w16sdtfl w16du wp14">
   <w:abstractNum w:abstractNumId="0" w15:restartNumberingAfterBreak="0">
-    <w:nsid w:val="1AE32BBA"/>
+    <w:nsid w:val="00A55C1B"/>
     <w:multiLevelType w:val="hybridMultilevel"/>
-    <w:tmpl w:val="59046492"/>
-    <w:lvl w:ilvl="0" w:tplc="C052976C">
+    <w:tmpl w:val="8BB2AEA6"/>
+    <w:lvl w:ilvl="0" w:tplc="9CD41330">
       <w:start w:val="1"/>
       <w:numFmt w:val="bullet"/>
       <w:lvlText w:val="●"/>
@@ -2096,7 +2169,7 @@
         <w:ind w:left="720" w:hanging="360"/>
       </w:pPr>
     </w:lvl>
-    <w:lvl w:ilvl="1" w:tplc="8C6C8284">
+    <w:lvl w:ilvl="1" w:tplc="9E023612">
       <w:start w:val="1"/>
       <w:numFmt w:val="bullet"/>
       <w:lvlText w:val="○"/>
@@ -2105,7 +2178,7 @@
         <w:ind w:left="1440" w:hanging="360"/>
       </w:pPr>
     </w:lvl>
-    <w:lvl w:ilvl="2" w:tplc="9C061F5C">
+    <w:lvl w:ilvl="2" w:tplc="D7405C18">
       <w:start w:val="1"/>
       <w:numFmt w:val="bullet"/>
       <w:lvlText w:val="■"/>
@@ -2114,7 +2187,7 @@
         <w:ind w:left="2160" w:hanging="360"/>
       </w:pPr>
     </w:lvl>
-    <w:lvl w:ilvl="3" w:tplc="51522D0A">
+    <w:lvl w:ilvl="3" w:tplc="82E4D426">
       <w:start w:val="1"/>
       <w:numFmt w:val="bullet"/>
       <w:lvlText w:val="●"/>
@@ -2123,7 +2196,7 @@
         <w:ind w:left="2880" w:hanging="360"/>
       </w:pPr>
     </w:lvl>
-    <w:lvl w:ilvl="4" w:tplc="22A8D19E">
+    <w:lvl w:ilvl="4" w:tplc="606C8C74">
       <w:start w:val="1"/>
       <w:numFmt w:val="bullet"/>
       <w:lvlText w:val="○"/>
@@ -2132,7 +2205,7 @@
         <w:ind w:left="3600" w:hanging="360"/>
       </w:pPr>
     </w:lvl>
-    <w:lvl w:ilvl="5" w:tplc="55E6DF60">
+    <w:lvl w:ilvl="5" w:tplc="AF389AD2">
       <w:start w:val="1"/>
       <w:numFmt w:val="bullet"/>
       <w:lvlText w:val="■"/>
@@ -2141,7 +2214,7 @@
         <w:ind w:left="4320" w:hanging="360"/>
       </w:pPr>
     </w:lvl>
-    <w:lvl w:ilvl="6" w:tplc="ECAC3090">
+    <w:lvl w:ilvl="6" w:tplc="CF78C426">
       <w:start w:val="1"/>
       <w:numFmt w:val="bullet"/>
       <w:lvlText w:val="●"/>
@@ -2150,7 +2223,7 @@
         <w:ind w:left="5040" w:hanging="360"/>
       </w:pPr>
     </w:lvl>
-    <w:lvl w:ilvl="7" w:tplc="5F7CA7D6">
+    <w:lvl w:ilvl="7" w:tplc="84D45BCE">
       <w:start w:val="1"/>
       <w:numFmt w:val="bullet"/>
       <w:lvlText w:val="●"/>
@@ -2159,7 +2232,7 @@
         <w:ind w:left="5760" w:hanging="360"/>
       </w:pPr>
     </w:lvl>
-    <w:lvl w:ilvl="8" w:tplc="2C308B8E">
+    <w:lvl w:ilvl="8" w:tplc="4E30F658">
       <w:start w:val="1"/>
       <w:numFmt w:val="bullet"/>
       <w:lvlText w:val="●"/>
@@ -2170,6 +2243,74 @@
     </w:lvl>
   </w:abstractNum>
   <w:abstractNum w:abstractNumId="1" w15:restartNumberingAfterBreak="0">
+    <w:nsid w:val="19C6763A"/>
+    <w:multiLevelType w:val="hybridMultilevel"/>
+    <w:tmpl w:val="B6A80282"/>
+    <w:lvl w:ilvl="0" w:tplc="7BC81814">
+      <w:start w:val="1"/>
+      <w:numFmt w:val="bullet"/>
+      <w:lvlText w:val="•"/>
+      <w:lvlJc w:val="left"/>
+      <w:pPr>
+        <w:ind w:left="245" w:hanging="175"/>
+      </w:pPr>
+      <w:rPr>
+        <w:color w:val="2E5C8A"/>
+        <w:sz w:val="19"/>
+        <w:szCs w:val="19"/>
+      </w:rPr>
+    </w:lvl>
+    <w:lvl w:ilvl="1" w:tplc="3886FBE8">
+      <w:start w:val="1"/>
+      <w:numFmt w:val="bullet"/>
+      <w:lvlText w:val="–"/>
+      <w:lvlJc w:val="left"/>
+      <w:pPr>
+        <w:ind w:left="520" w:hanging="175"/>
+      </w:pPr>
+      <w:rPr>
+        <w:color w:val="2E5C8A"/>
+        <w:sz w:val="19"/>
+        <w:szCs w:val="19"/>
+      </w:rPr>
+    </w:lvl>
+    <w:lvl w:ilvl="2" w:tplc="B2283F06">
+      <w:numFmt w:val="decimal"/>
+      <w:lvlText w:val=""/>
+      <w:lvlJc w:val="left"/>
+    </w:lvl>
+    <w:lvl w:ilvl="3" w:tplc="2166CA06">
+      <w:numFmt w:val="decimal"/>
+      <w:lvlText w:val=""/>
+      <w:lvlJc w:val="left"/>
+    </w:lvl>
+    <w:lvl w:ilvl="4" w:tplc="F64E9E00">
+      <w:numFmt w:val="decimal"/>
+      <w:lvlText w:val=""/>
+      <w:lvlJc w:val="left"/>
+    </w:lvl>
+    <w:lvl w:ilvl="5" w:tplc="E95AA97E">
+      <w:numFmt w:val="decimal"/>
+      <w:lvlText w:val=""/>
+      <w:lvlJc w:val="left"/>
+    </w:lvl>
+    <w:lvl w:ilvl="6" w:tplc="FA2CFB20">
+      <w:numFmt w:val="decimal"/>
+      <w:lvlText w:val=""/>
+      <w:lvlJc w:val="left"/>
+    </w:lvl>
+    <w:lvl w:ilvl="7" w:tplc="816CADB6">
+      <w:numFmt w:val="decimal"/>
+      <w:lvlText w:val=""/>
+      <w:lvlJc w:val="left"/>
+    </w:lvl>
+    <w:lvl w:ilvl="8" w:tplc="99A6F7A4">
+      <w:numFmt w:val="decimal"/>
+      <w:lvlText w:val=""/>
+      <w:lvlJc w:val="left"/>
+    </w:lvl>
+  </w:abstractNum>
+  <w:abstractNum w:abstractNumId="2" w15:restartNumberingAfterBreak="0">
     <w:nsid w:val="72C11964"/>
     <w:multiLevelType w:val="hybridMultilevel"/>
     <w:tmpl w:val="A1D4E504"/>
@@ -2237,14 +2378,20 @@
       <w:lvlJc w:val="left"/>
     </w:lvl>
   </w:abstractNum>
-  <w:num w:numId="1" w16cid:durableId="316349575">
+  <w:num w:numId="1" w16cid:durableId="1681353692">
     <w:abstractNumId w:val="0"/>
     <w:lvlOverride w:ilvl="0">
       <w:startOverride w:val="1"/>
     </w:lvlOverride>
   </w:num>
-  <w:num w:numId="2" w16cid:durableId="1640182040">
+  <w:num w:numId="2" w16cid:durableId="540283257">
     <w:abstractNumId w:val="1"/>
+    <w:lvlOverride w:ilvl="0">
+      <w:startOverride w:val="1"/>
+    </w:lvlOverride>
+  </w:num>
+  <w:num w:numId="3" w16cid:durableId="1640182040">
+    <w:abstractNumId w:val="2"/>
     <w:lvlOverride w:ilvl="0">
       <w:startOverride w:val="1"/>
     </w:lvlOverride>
@@ -2732,6 +2879,7 @@
   <w:style w:type="character" w:default="1" w:styleId="DefaultParagraphFont">
     <w:name w:val="Default Paragraph Font"/>
     <w:uiPriority w:val="1"/>
+    <w:semiHidden/>
     <w:unhideWhenUsed/>
   </w:style>
   <w:style w:type="table" w:default="1" w:styleId="TableNormal">
@@ -2839,16 +2987,16 @@
       <w:szCs w:val="20"/>
     </w:rPr>
   </w:style>
-  <w:style w:type="paragraph" w:customStyle="1" w:styleId="isselectedend">
-    <w:name w:val="isselectedend"/>
-    <w:basedOn w:val="Normal"/>
-    <w:rsid w:val="000D43FE"/>
-    <w:pPr>
-      <w:spacing w:before="100" w:beforeAutospacing="1" w:after="100" w:afterAutospacing="1"/>
-    </w:pPr>
+  <w:style w:type="character" w:styleId="UnresolvedMention">
+    <w:name w:val="Unresolved Mention"/>
+    <w:basedOn w:val="DefaultParagraphFont"/>
+    <w:uiPriority w:val="99"/>
+    <w:semiHidden/>
+    <w:unhideWhenUsed/>
+    <w:rsid w:val="00F33510"/>
     <w:rPr>
-      <w:sz w:val="24"/>
-      <w:szCs w:val="24"/>
+      <w:color w:val="605E5C"/>
+      <w:shd w:val="clear" w:color="auto" w:fill="E1DFDD"/>
     </w:rPr>
   </w:style>
 </w:styles>

</xml_diff>